<commit_message>
add python script to edit docx
</commit_message>
<xml_diff>
--- a/test_doc/test_file.docx
+++ b/test_doc/test_file.docx
@@ -475,6 +475,7 @@
         <w:autoSpaceDN/>
         <w:jc w:val="center"/>
         <w:rPr>
+          <w:rFonts w:ascii="Arial" w:hAnsi="Arial" w:cs="Arial"/>
           <w:b/>
           <w:sz w:val="28"/>
           <w:szCs w:val="24"/>
@@ -483,6 +484,7 @@
       </w:pPr>
       <w:r>
         <w:rPr>
+          <w:rFonts w:ascii="Arial" w:hAnsi="Arial" w:cs="Arial"/>
           <w:b/>
           <w:sz w:val="28"/>
           <w:szCs w:val="24"/>
@@ -2931,6 +2933,7 @@
         <w:ind w:firstLine="709"/>
         <w:jc w:val="both"/>
         <w:rPr>
+          <w:rFonts w:ascii="Adega Serif" w:hAnsi="Adega Serif"/>
           <w:sz w:val="28"/>
           <w:szCs w:val="28"/>
           <w:lang w:eastAsia="zh-CN"/>
@@ -2938,14 +2941,88 @@
       </w:pPr>
       <w:r>
         <w:rPr>
-          <w:sz w:val="28"/>
-          <w:szCs w:val="28"/>
-          <w:lang w:eastAsia="ru-RU"/>
-        </w:rPr>
-        <w:t>Курсовая работа написана на тему</w:t>
-      </w:r>
-      <w:r>
-        <w:rPr>
+          <w:rFonts w:ascii="Calibri" w:hAnsi="Calibri" w:cs="Calibri"/>
+          <w:sz w:val="28"/>
+          <w:szCs w:val="28"/>
+          <w:lang w:eastAsia="ru-RU"/>
+        </w:rPr>
+        <w:t>Курсовая</w:t>
+      </w:r>
+      <w:r>
+        <w:rPr>
+          <w:rFonts w:ascii="Adega Serif" w:hAnsi="Adega Serif"/>
+          <w:sz w:val="28"/>
+          <w:szCs w:val="28"/>
+          <w:lang w:eastAsia="ru-RU"/>
+        </w:rPr>
+        <w:t xml:space="preserve"> </w:t>
+      </w:r>
+      <w:r>
+        <w:rPr>
+          <w:rFonts w:ascii="Calibri" w:hAnsi="Calibri" w:cs="Calibri"/>
+          <w:sz w:val="28"/>
+          <w:szCs w:val="28"/>
+          <w:lang w:eastAsia="ru-RU"/>
+        </w:rPr>
+        <w:t>работа</w:t>
+      </w:r>
+      <w:r>
+        <w:rPr>
+          <w:rFonts w:ascii="Adega Serif" w:hAnsi="Adega Serif"/>
+          <w:sz w:val="28"/>
+          <w:szCs w:val="28"/>
+          <w:lang w:eastAsia="ru-RU"/>
+        </w:rPr>
+        <w:t xml:space="preserve"> </w:t>
+      </w:r>
+      <w:r>
+        <w:rPr>
+          <w:rFonts w:ascii="Calibri" w:hAnsi="Calibri" w:cs="Calibri"/>
+          <w:sz w:val="28"/>
+          <w:szCs w:val="28"/>
+          <w:lang w:eastAsia="ru-RU"/>
+        </w:rPr>
+        <w:t>написана</w:t>
+      </w:r>
+      <w:r>
+        <w:rPr>
+          <w:rFonts w:ascii="Adega Serif" w:hAnsi="Adega Serif"/>
+          <w:sz w:val="28"/>
+          <w:szCs w:val="28"/>
+          <w:lang w:eastAsia="ru-RU"/>
+        </w:rPr>
+        <w:t xml:space="preserve"> </w:t>
+      </w:r>
+      <w:r>
+        <w:rPr>
+          <w:rFonts w:ascii="Calibri" w:hAnsi="Calibri" w:cs="Calibri"/>
+          <w:sz w:val="28"/>
+          <w:szCs w:val="28"/>
+          <w:lang w:eastAsia="ru-RU"/>
+        </w:rPr>
+        <w:t>на</w:t>
+      </w:r>
+      <w:r>
+        <w:rPr>
+          <w:rFonts w:ascii="Adega Serif" w:hAnsi="Adega Serif"/>
+          <w:sz w:val="28"/>
+          <w:szCs w:val="28"/>
+          <w:lang w:eastAsia="ru-RU"/>
+        </w:rPr>
+        <w:t xml:space="preserve"> </w:t>
+      </w:r>
+      <w:r>
+        <w:rPr>
+          <w:rFonts w:ascii="Calibri" w:hAnsi="Calibri" w:cs="Calibri"/>
+          <w:sz w:val="28"/>
+          <w:szCs w:val="28"/>
+          <w:lang w:eastAsia="ru-RU"/>
+        </w:rPr>
+        <w:t>тему</w:t>
+      </w:r>
+      <w:r>
+        <w:rPr>
+          <w:rFonts w:ascii="Adega Serif" w:hAnsi="Adega Serif"/>
           <w:sz w:val="28"/>
           <w:szCs w:val="28"/>
           <w:lang w:eastAsia="ru-RU"/>
@@ -2954,15 +3031,35 @@
       </w:r>
       <w:r>
         <w:rPr>
-          <w:sz w:val="28"/>
-          <w:szCs w:val="24"/>
-          <w:lang w:eastAsia="ru-RU"/>
-        </w:rPr>
-        <w:t xml:space="preserve"> «Разработка </w:t>
+          <w:rFonts w:ascii="Adega Serif" w:hAnsi="Adega Serif"/>
+          <w:sz w:val="28"/>
+          <w:szCs w:val="24"/>
+          <w:lang w:eastAsia="ru-RU"/>
+        </w:rPr>
+        <w:t xml:space="preserve"> «</w:t>
+      </w:r>
+      <w:r>
+        <w:rPr>
+          <w:rFonts w:ascii="Calibri" w:hAnsi="Calibri" w:cs="Calibri"/>
+          <w:sz w:val="28"/>
+          <w:szCs w:val="24"/>
+          <w:lang w:eastAsia="ru-RU"/>
+        </w:rPr>
+        <w:t>Разработка</w:t>
+      </w:r>
+      <w:r>
+        <w:rPr>
+          <w:rFonts w:ascii="Adega Serif" w:hAnsi="Adega Serif"/>
+          <w:sz w:val="28"/>
+          <w:szCs w:val="24"/>
+          <w:lang w:eastAsia="ru-RU"/>
+        </w:rPr>
+        <w:t xml:space="preserve"> </w:t>
       </w:r>
       <w:proofErr w:type="spellStart"/>
       <w:r>
         <w:rPr>
+          <w:rFonts w:ascii="Adega Serif" w:hAnsi="Adega Serif"/>
           <w:sz w:val="28"/>
           <w:szCs w:val="24"/>
           <w:lang w:eastAsia="ru-RU"/>
@@ -2972,14 +3069,43 @@
       <w:proofErr w:type="spellEnd"/>
       <w:r>
         <w:rPr>
-          <w:sz w:val="28"/>
-          <w:szCs w:val="24"/>
-          <w:lang w:eastAsia="ru-RU"/>
-        </w:rPr>
-        <w:t>-приложения вычислени</w:t>
-      </w:r>
-      <w:r>
-        <w:rPr>
+          <w:rFonts w:ascii="Adega Serif" w:hAnsi="Adega Serif"/>
+          <w:sz w:val="28"/>
+          <w:szCs w:val="24"/>
+          <w:lang w:eastAsia="ru-RU"/>
+        </w:rPr>
+        <w:t>-</w:t>
+      </w:r>
+      <w:r>
+        <w:rPr>
+          <w:rFonts w:ascii="Calibri" w:hAnsi="Calibri" w:cs="Calibri"/>
+          <w:sz w:val="28"/>
+          <w:szCs w:val="24"/>
+          <w:lang w:eastAsia="ru-RU"/>
+        </w:rPr>
+        <w:t>приложения</w:t>
+      </w:r>
+      <w:r>
+        <w:rPr>
+          <w:rFonts w:ascii="Adega Serif" w:hAnsi="Adega Serif"/>
+          <w:sz w:val="28"/>
+          <w:szCs w:val="24"/>
+          <w:lang w:eastAsia="ru-RU"/>
+        </w:rPr>
+        <w:t xml:space="preserve"> </w:t>
+      </w:r>
+      <w:r>
+        <w:rPr>
+          <w:rFonts w:ascii="Calibri" w:hAnsi="Calibri" w:cs="Calibri"/>
+          <w:sz w:val="28"/>
+          <w:szCs w:val="24"/>
+          <w:lang w:eastAsia="ru-RU"/>
+        </w:rPr>
+        <w:t>вычислени</w:t>
+      </w:r>
+      <w:r>
+        <w:rPr>
+          <w:rFonts w:ascii="Calibri" w:hAnsi="Calibri" w:cs="Calibri"/>
           <w:sz w:val="28"/>
           <w:szCs w:val="24"/>
           <w:lang w:eastAsia="ru-RU"/>
@@ -2988,11 +3114,57 @@
       </w:r>
       <w:r>
         <w:rPr>
-          <w:sz w:val="28"/>
-          <w:szCs w:val="24"/>
-          <w:lang w:eastAsia="ru-RU"/>
-        </w:rPr>
-        <w:t xml:space="preserve"> ранга матрицы».</w:t>
+          <w:rFonts w:ascii="Adega Serif" w:hAnsi="Adega Serif"/>
+          <w:sz w:val="28"/>
+          <w:szCs w:val="24"/>
+          <w:lang w:eastAsia="ru-RU"/>
+        </w:rPr>
+        <w:t xml:space="preserve"> </w:t>
+      </w:r>
+      <w:r>
+        <w:rPr>
+          <w:rFonts w:ascii="Calibri" w:hAnsi="Calibri" w:cs="Calibri"/>
+          <w:sz w:val="28"/>
+          <w:szCs w:val="24"/>
+          <w:lang w:eastAsia="ru-RU"/>
+        </w:rPr>
+        <w:t>ранга</w:t>
+      </w:r>
+      <w:r>
+        <w:rPr>
+          <w:rFonts w:ascii="Adega Serif" w:hAnsi="Adega Serif"/>
+          <w:sz w:val="28"/>
+          <w:szCs w:val="24"/>
+          <w:lang w:eastAsia="ru-RU"/>
+        </w:rPr>
+        <w:t xml:space="preserve"> </w:t>
+      </w:r>
+      <w:r>
+        <w:rPr>
+          <w:rFonts w:ascii="Calibri" w:hAnsi="Calibri" w:cs="Calibri"/>
+          <w:sz w:val="28"/>
+          <w:szCs w:val="24"/>
+          <w:lang w:eastAsia="ru-RU"/>
+        </w:rPr>
+        <w:t>матрицы</w:t>
+      </w:r>
+      <w:r>
+        <w:rPr>
+          <w:rFonts w:ascii="Adega Serif" w:hAnsi="Adega Serif" w:cs="Adega Serif"/>
+          <w:sz w:val="28"/>
+          <w:szCs w:val="24"/>
+          <w:lang w:eastAsia="ru-RU"/>
+        </w:rPr>
+        <w:t>»</w:t>
+      </w:r>
+      <w:r>
+        <w:rPr>
+          <w:rFonts w:ascii="Adega Serif" w:hAnsi="Adega Serif"/>
+          <w:sz w:val="28"/>
+          <w:szCs w:val="24"/>
+          <w:lang w:eastAsia="ru-RU"/>
+        </w:rPr>
+        <w:t>.</w:t>
       </w:r>
     </w:p>
     <w:p>
@@ -3159,31 +3331,31 @@
         <w:contextualSpacing/>
         <w:jc w:val="both"/>
         <w:rPr>
-          <w:sz w:val="28"/>
-          <w:szCs w:val="28"/>
-          <w:lang w:eastAsia="ru-RU"/>
-        </w:rPr>
-      </w:pPr>
-      <w:r>
-        <w:rPr>
-          <w:sz w:val="28"/>
-          <w:szCs w:val="28"/>
+          <w:sz w:val="36"/>
+          <w:szCs w:val="36"/>
+          <w:lang w:eastAsia="ru-RU"/>
+        </w:rPr>
+      </w:pPr>
+      <w:r>
+        <w:rPr>
+          <w:sz w:val="36"/>
+          <w:szCs w:val="36"/>
           <w:lang w:eastAsia="ru-RU"/>
         </w:rPr>
         <w:t>Объем работы: 3</w:t>
       </w:r>
       <w:r>
         <w:rPr>
-          <w:sz w:val="28"/>
-          <w:szCs w:val="28"/>
+          <w:sz w:val="36"/>
+          <w:szCs w:val="36"/>
           <w:lang w:eastAsia="ru-RU"/>
         </w:rPr>
         <w:t>3</w:t>
       </w:r>
       <w:r>
         <w:rPr>
-          <w:sz w:val="28"/>
-          <w:szCs w:val="28"/>
+          <w:sz w:val="36"/>
+          <w:szCs w:val="36"/>
           <w:lang w:eastAsia="ru-RU"/>
         </w:rPr>
         <w:t xml:space="preserve"> стр.</w:t>
@@ -3199,47 +3371,47 @@
         <w:contextualSpacing/>
         <w:jc w:val="both"/>
         <w:rPr>
-          <w:sz w:val="28"/>
-          <w:szCs w:val="28"/>
-          <w:lang w:eastAsia="ru-RU"/>
-        </w:rPr>
-      </w:pPr>
-      <w:r>
-        <w:rPr>
-          <w:sz w:val="28"/>
-          <w:szCs w:val="28"/>
+          <w:sz w:val="36"/>
+          <w:szCs w:val="36"/>
+          <w:lang w:eastAsia="ru-RU"/>
+        </w:rPr>
+      </w:pPr>
+      <w:r>
+        <w:rPr>
+          <w:sz w:val="36"/>
+          <w:szCs w:val="36"/>
           <w:lang w:eastAsia="ru-RU"/>
         </w:rPr>
         <w:t xml:space="preserve">В работе содержится: </w:t>
       </w:r>
       <w:r>
         <w:rPr>
-          <w:sz w:val="28"/>
-          <w:szCs w:val="28"/>
+          <w:sz w:val="36"/>
+          <w:szCs w:val="36"/>
           <w:lang w:eastAsia="ru-RU"/>
         </w:rPr>
         <w:t>5</w:t>
       </w:r>
       <w:r>
         <w:rPr>
-          <w:sz w:val="28"/>
-          <w:szCs w:val="28"/>
+          <w:sz w:val="36"/>
+          <w:szCs w:val="36"/>
           <w:lang w:eastAsia="ru-RU"/>
         </w:rPr>
         <w:t xml:space="preserve"> рисунков, </w:t>
       </w:r>
       <w:r>
         <w:rPr>
-          <w:sz w:val="28"/>
-          <w:szCs w:val="28"/>
+          <w:sz w:val="36"/>
+          <w:szCs w:val="36"/>
           <w:lang w:eastAsia="ru-RU"/>
         </w:rPr>
         <w:t>1</w:t>
       </w:r>
       <w:r>
         <w:rPr>
-          <w:sz w:val="28"/>
-          <w:szCs w:val="28"/>
+          <w:sz w:val="36"/>
+          <w:szCs w:val="36"/>
           <w:lang w:eastAsia="ru-RU"/>
         </w:rPr>
         <w:t xml:space="preserve"> приложения, и 5 источников.</w:t>
@@ -3565,8 +3737,6 @@
         <w:rPr>
           <w:noProof/>
           <w:color w:val="000000"/>
-          <w:sz w:val="28"/>
-          <w:szCs w:val="24"/>
           <w:lang w:eastAsia="ru-RU"/>
         </w:rPr>
         <w:t>Введение</w:t>
@@ -3574,8 +3744,6 @@
       <w:r>
         <w:rPr>
           <w:noProof/>
-          <w:sz w:val="28"/>
-          <w:szCs w:val="24"/>
           <w:lang w:eastAsia="ru-RU"/>
         </w:rPr>
         <w:tab/>
@@ -3583,8 +3751,6 @@
       <w:r>
         <w:rPr>
           <w:noProof/>
-          <w:sz w:val="28"/>
-          <w:szCs w:val="24"/>
           <w:lang w:eastAsia="ru-RU"/>
         </w:rPr>
         <w:t>5</w:t>
@@ -3610,8 +3776,6 @@
       <w:r>
         <w:rPr>
           <w:noProof/>
-          <w:sz w:val="28"/>
-          <w:szCs w:val="24"/>
           <w:lang w:eastAsia="ru-RU"/>
         </w:rPr>
         <w:t>1. Теоретическая часть</w:t>
@@ -3619,19 +3783,9 @@
       <w:r>
         <w:rPr>
           <w:noProof/>
-          <w:sz w:val="28"/>
-          <w:szCs w:val="24"/>
           <w:lang w:eastAsia="ru-RU"/>
         </w:rPr>
         <w:tab/>
-      </w:r>
-      <w:r>
-        <w:rPr>
-          <w:noProof/>
-          <w:sz w:val="28"/>
-          <w:szCs w:val="24"/>
-          <w:lang w:eastAsia="ru-RU"/>
-        </w:rPr>
         <w:t>6</w:t>
       </w:r>
     </w:p>
@@ -5799,8 +5953,8 @@
         <w:outlineLvl w:val="0"/>
         <w:rPr>
           <w:color w:val="000000"/>
-          <w:sz w:val="28"/>
-          <w:szCs w:val="28"/>
+          <w:sz w:val="40"/>
+          <w:szCs w:val="40"/>
           <w:lang w:eastAsia="ru-RU"/>
         </w:rPr>
       </w:pPr>
@@ -5808,8 +5962,8 @@
         <w:rPr>
           <w:bCs/>
           <w:color w:val="000000"/>
-          <w:sz w:val="28"/>
-          <w:szCs w:val="28"/>
+          <w:sz w:val="40"/>
+          <w:szCs w:val="40"/>
           <w:lang w:eastAsia="ru-RU"/>
         </w:rPr>
         <w:lastRenderedPageBreak/>
@@ -5825,15 +5979,15 @@
         <w:ind w:firstLine="709"/>
         <w:jc w:val="both"/>
         <w:rPr>
-          <w:sz w:val="28"/>
-          <w:szCs w:val="28"/>
-          <w:lang w:eastAsia="ru-RU"/>
-        </w:rPr>
-      </w:pPr>
-      <w:r>
-        <w:rPr>
-          <w:sz w:val="28"/>
-          <w:szCs w:val="28"/>
+          <w:sz w:val="20"/>
+          <w:szCs w:val="20"/>
+          <w:lang w:eastAsia="ru-RU"/>
+        </w:rPr>
+      </w:pPr>
+      <w:r>
+        <w:rPr>
+          <w:sz w:val="20"/>
+          <w:szCs w:val="20"/>
           <w:lang w:eastAsia="ru-RU"/>
         </w:rPr>
         <w:t xml:space="preserve">В наше время использование программных средств для выполнения инженерных расчетов становится все более распространенным. В рамках данной курсовой работы рассматривается вычисление ранга матрицы под операционную систему </w:t>
@@ -5841,8 +5995,8 @@
       <w:proofErr w:type="spellStart"/>
       <w:r>
         <w:rPr>
-          <w:sz w:val="28"/>
-          <w:szCs w:val="28"/>
+          <w:sz w:val="20"/>
+          <w:szCs w:val="20"/>
           <w:lang w:eastAsia="ru-RU"/>
         </w:rPr>
         <w:t>Windows</w:t>
@@ -5850,8 +6004,8 @@
       <w:proofErr w:type="spellEnd"/>
       <w:r>
         <w:rPr>
-          <w:sz w:val="28"/>
-          <w:szCs w:val="28"/>
+          <w:sz w:val="20"/>
+          <w:szCs w:val="20"/>
           <w:lang w:eastAsia="ru-RU"/>
         </w:rPr>
         <w:t xml:space="preserve"> с использованием языка программирования C#.</w:t>
@@ -6314,7 +6468,7 @@
           </mc:Choice>
           <mc:Fallback>
             <w:pict>
-              <v:rect w14:anchorId="765ABD28" id="Прямоугольник 3" o:spid="_x0000_s1026" style="position:absolute;margin-left:231pt;margin-top:87.8pt;width:58.5pt;height:40.5pt;z-index:251642880;visibility:visible;mso-wrap-style:square;mso-wrap-distance-left:9pt;mso-wrap-distance-top:0;mso-wrap-distance-right:9pt;mso-wrap-distance-bottom:0;mso-position-horizontal:absolute;mso-position-horizontal-relative:text;mso-position-vertical:absolute;mso-position-vertical-relative:text;v-text-anchor:middle" o:gfxdata="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" fillcolor="white [3212]" strokecolor="white [3212]" strokeweight="2pt"/>
+              <v:rect w14:anchorId="28700D1C" id="Прямоугольник 3" o:spid="_x0000_s1026" style="position:absolute;margin-left:231pt;margin-top:87.8pt;width:58.5pt;height:40.5pt;z-index:251642880;visibility:visible;mso-wrap-style:square;mso-wrap-distance-left:9pt;mso-wrap-distance-top:0;mso-wrap-distance-right:9pt;mso-wrap-distance-bottom:0;mso-position-horizontal:absolute;mso-position-horizontal-relative:text;mso-position-vertical:absolute;mso-position-vertical-relative:text;v-text-anchor:middle" o:gfxdata="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" fillcolor="white [3212]" strokecolor="white [3212]" strokeweight="2pt"/>
             </w:pict>
           </mc:Fallback>
         </mc:AlternateContent>
@@ -6393,7 +6547,7 @@
           </mc:Choice>
           <mc:Fallback>
             <w:pict>
-              <v:rect w14:anchorId="462E71E7" id="Прямоугольник 2" o:spid="_x0000_s1026" style="position:absolute;margin-left:208.25pt;margin-top:17.95pt;width:37.5pt;height:27.75pt;z-index:251649024;visibility:visible;mso-wrap-style:square;mso-wrap-distance-left:9pt;mso-wrap-distance-top:0;mso-wrap-distance-right:9pt;mso-wrap-distance-bottom:0;mso-position-horizontal:absolute;mso-position-horizontal-relative:text;mso-position-vertical:absolute;mso-position-vertical-relative:text;v-text-anchor:middle" o:gfxdata="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" fillcolor="white [3212]" strokecolor="white [3212]" strokeweight="2pt"/>
+              <v:rect w14:anchorId="621EE675" id="Прямоугольник 2" o:spid="_x0000_s1026" style="position:absolute;margin-left:208.25pt;margin-top:17.95pt;width:37.5pt;height:27.75pt;z-index:251649024;visibility:visible;mso-wrap-style:square;mso-wrap-distance-left:9pt;mso-wrap-distance-top:0;mso-wrap-distance-right:9pt;mso-wrap-distance-bottom:0;mso-position-horizontal:absolute;mso-position-horizontal-relative:text;mso-position-vertical:absolute;mso-position-vertical-relative:text;v-text-anchor:middle" o:gfxdata="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" fillcolor="white [3212]" strokecolor="white [3212]" strokeweight="2pt"/>
             </w:pict>
           </mc:Fallback>
         </mc:AlternateContent>
@@ -6427,7 +6581,6 @@
           <w:szCs w:val="28"/>
           <w:lang w:eastAsia="ru-RU"/>
         </w:rPr>
-        <w:lastRenderedPageBreak/>
         <w:t>1.</w:t>
       </w:r>
       <w:r>
@@ -6541,7 +6694,16 @@
           <w:szCs w:val="28"/>
           <w:lang w:eastAsia="ru-RU"/>
         </w:rPr>
-        <w:t xml:space="preserve"> в компании </w:t>
+        <w:t xml:space="preserve"> в </w:t>
+      </w:r>
+      <w:r>
+        <w:rPr>
+          <w:sz w:val="28"/>
+          <w:szCs w:val="28"/>
+          <w:lang w:eastAsia="ru-RU"/>
+        </w:rPr>
+        <w:lastRenderedPageBreak/>
+        <w:t xml:space="preserve">компании </w:t>
       </w:r>
       <w:proofErr w:type="spellStart"/>
       <w:r>
@@ -6975,8 +7137,237 @@
           <w:szCs w:val="28"/>
           <w:lang w:eastAsia="ru-RU"/>
         </w:rPr>
+        <w:t>Windows</w:t>
+      </w:r>
+      <w:proofErr w:type="spellEnd"/>
+      <w:r>
+        <w:rPr>
+          <w:sz w:val="28"/>
+          <w:szCs w:val="28"/>
+          <w:lang w:eastAsia="ru-RU"/>
+        </w:rPr>
+        <w:t xml:space="preserve"> CE, .NET </w:t>
+      </w:r>
+      <w:proofErr w:type="spellStart"/>
+      <w:r>
+        <w:rPr>
+          <w:sz w:val="28"/>
+          <w:szCs w:val="28"/>
+          <w:lang w:eastAsia="ru-RU"/>
+        </w:rPr>
+        <w:t>Framework</w:t>
+      </w:r>
+      <w:proofErr w:type="spellEnd"/>
+      <w:r>
+        <w:rPr>
+          <w:sz w:val="28"/>
+          <w:szCs w:val="28"/>
+          <w:lang w:eastAsia="ru-RU"/>
+        </w:rPr>
+        <w:t xml:space="preserve">, </w:t>
+      </w:r>
+      <w:proofErr w:type="spellStart"/>
+      <w:r>
+        <w:rPr>
+          <w:sz w:val="28"/>
+          <w:szCs w:val="28"/>
+          <w:lang w:eastAsia="ru-RU"/>
+        </w:rPr>
+        <w:t>Xbox</w:t>
+      </w:r>
+      <w:proofErr w:type="spellEnd"/>
+      <w:r>
+        <w:rPr>
+          <w:sz w:val="28"/>
+          <w:szCs w:val="28"/>
+          <w:lang w:eastAsia="ru-RU"/>
+        </w:rPr>
+        <w:t xml:space="preserve">, </w:t>
+      </w:r>
+      <w:proofErr w:type="spellStart"/>
+      <w:r>
+        <w:rPr>
+          <w:sz w:val="28"/>
+          <w:szCs w:val="28"/>
+          <w:lang w:eastAsia="ru-RU"/>
+        </w:rPr>
+        <w:t>Windows</w:t>
+      </w:r>
+      <w:proofErr w:type="spellEnd"/>
+      <w:r>
+        <w:rPr>
+          <w:sz w:val="28"/>
+          <w:szCs w:val="28"/>
+          <w:lang w:eastAsia="ru-RU"/>
+        </w:rPr>
+        <w:t xml:space="preserve"> </w:t>
+      </w:r>
+      <w:proofErr w:type="spellStart"/>
+      <w:r>
+        <w:rPr>
+          <w:sz w:val="28"/>
+          <w:szCs w:val="28"/>
+          <w:lang w:eastAsia="ru-RU"/>
+        </w:rPr>
+        <w:t>Phone</w:t>
+      </w:r>
+      <w:proofErr w:type="spellEnd"/>
+      <w:r>
+        <w:rPr>
+          <w:sz w:val="28"/>
+          <w:szCs w:val="28"/>
+          <w:lang w:eastAsia="ru-RU"/>
+        </w:rPr>
+        <w:t xml:space="preserve">, .NET </w:t>
+      </w:r>
+      <w:proofErr w:type="spellStart"/>
+      <w:r>
+        <w:rPr>
+          <w:sz w:val="28"/>
+          <w:szCs w:val="28"/>
+          <w:lang w:eastAsia="ru-RU"/>
+        </w:rPr>
+        <w:t>Compact</w:t>
+      </w:r>
+      <w:proofErr w:type="spellEnd"/>
+      <w:r>
+        <w:rPr>
+          <w:sz w:val="28"/>
+          <w:szCs w:val="28"/>
+          <w:lang w:eastAsia="ru-RU"/>
+        </w:rPr>
+        <w:t xml:space="preserve"> </w:t>
+      </w:r>
+      <w:proofErr w:type="spellStart"/>
+      <w:r>
+        <w:rPr>
+          <w:sz w:val="28"/>
+          <w:szCs w:val="28"/>
+          <w:lang w:eastAsia="ru-RU"/>
+        </w:rPr>
+        <w:t>Framework</w:t>
+      </w:r>
+      <w:proofErr w:type="spellEnd"/>
+      <w:r>
+        <w:rPr>
+          <w:sz w:val="28"/>
+          <w:szCs w:val="28"/>
+          <w:lang w:eastAsia="ru-RU"/>
+        </w:rPr>
+        <w:t xml:space="preserve"> и </w:t>
+      </w:r>
+      <w:proofErr w:type="spellStart"/>
+      <w:r>
+        <w:rPr>
+          <w:sz w:val="28"/>
+          <w:szCs w:val="28"/>
+          <w:lang w:eastAsia="ru-RU"/>
+        </w:rPr>
+        <w:t>Silverlight</w:t>
+      </w:r>
+      <w:proofErr w:type="spellEnd"/>
+      <w:r>
+        <w:rPr>
+          <w:sz w:val="28"/>
+          <w:szCs w:val="28"/>
+          <w:lang w:eastAsia="ru-RU"/>
+        </w:rPr>
+        <w:t>.</w:t>
+      </w:r>
+    </w:p>
+    <w:p>
+      <w:pPr>
+        <w:widowControl/>
+        <w:autoSpaceDE/>
+        <w:autoSpaceDN/>
+        <w:spacing w:line="360" w:lineRule="auto"/>
+        <w:ind w:firstLine="709"/>
+        <w:jc w:val="both"/>
+        <w:rPr>
+          <w:sz w:val="28"/>
+          <w:szCs w:val="28"/>
+          <w:lang w:eastAsia="ru-RU"/>
+        </w:rPr>
+      </w:pPr>
+      <w:r>
+        <w:rPr>
+          <w:sz w:val="28"/>
+          <w:szCs w:val="28"/>
+          <w:lang w:eastAsia="ru-RU"/>
+        </w:rPr>
+        <w:t xml:space="preserve"> </w:t>
+      </w:r>
+      <w:proofErr w:type="spellStart"/>
+      <w:r>
+        <w:rPr>
+          <w:sz w:val="28"/>
+          <w:szCs w:val="28"/>
+          <w:lang w:eastAsia="ru-RU"/>
+        </w:rPr>
+        <w:t>Visual</w:t>
+      </w:r>
+      <w:proofErr w:type="spellEnd"/>
+      <w:r>
+        <w:rPr>
+          <w:sz w:val="28"/>
+          <w:szCs w:val="28"/>
+          <w:lang w:eastAsia="ru-RU"/>
+        </w:rPr>
+        <w:t xml:space="preserve"> </w:t>
+      </w:r>
+      <w:proofErr w:type="spellStart"/>
+      <w:r>
+        <w:rPr>
+          <w:sz w:val="28"/>
+          <w:szCs w:val="28"/>
+          <w:lang w:eastAsia="ru-RU"/>
+        </w:rPr>
+        <w:t>Studio</w:t>
+      </w:r>
+      <w:proofErr w:type="spellEnd"/>
+      <w:r>
+        <w:rPr>
+          <w:sz w:val="28"/>
+          <w:szCs w:val="28"/>
+          <w:lang w:eastAsia="ru-RU"/>
+        </w:rPr>
+        <w:t xml:space="preserve"> включает в себя редактор исходного кода с поддержкой технологии </w:t>
+      </w:r>
+      <w:proofErr w:type="spellStart"/>
+      <w:r>
+        <w:rPr>
+          <w:sz w:val="28"/>
+          <w:szCs w:val="28"/>
+          <w:lang w:eastAsia="ru-RU"/>
+        </w:rPr>
+        <w:t>IntelliSense</w:t>
+      </w:r>
+      <w:proofErr w:type="spellEnd"/>
+      <w:r>
+        <w:rPr>
+          <w:sz w:val="28"/>
+          <w:szCs w:val="28"/>
+          <w:lang w:eastAsia="ru-RU"/>
+        </w:rPr>
+        <w:t xml:space="preserve"> и возможностью простейшего рефакторинга кода. Встроенный отладчик может работать как отладчик уровня исходного кода, </w:t>
+      </w:r>
+      <w:r>
+        <w:rPr>
+          <w:sz w:val="28"/>
+          <w:szCs w:val="28"/>
+          <w:lang w:eastAsia="ru-RU"/>
+        </w:rPr>
         <w:lastRenderedPageBreak/>
-        <w:t>Windows</w:t>
+        <w:t xml:space="preserve">так и как отладчик машинного уровня. Остальные встраиваемые инструменты включают в себя редактор форм для упрощения создания графического интерфейса приложения, веб-редактор, дизайнер классов и дизайнер схемы базы данных. </w:t>
+      </w:r>
+      <w:proofErr w:type="spellStart"/>
+      <w:r>
+        <w:rPr>
+          <w:sz w:val="28"/>
+          <w:szCs w:val="28"/>
+          <w:lang w:eastAsia="ru-RU"/>
+        </w:rPr>
+        <w:t>Visual</w:t>
       </w:r>
       <w:proofErr w:type="spellEnd"/>
       <w:r>
@@ -6985,7 +7376,7 @@
           <w:szCs w:val="28"/>
           <w:lang w:eastAsia="ru-RU"/>
         </w:rPr>
-        <w:t xml:space="preserve"> CE, .NET </w:t>
+        <w:t xml:space="preserve"> </w:t>
       </w:r>
       <w:proofErr w:type="spellStart"/>
       <w:r>
@@ -6994,7 +7385,7 @@
           <w:szCs w:val="28"/>
           <w:lang w:eastAsia="ru-RU"/>
         </w:rPr>
-        <w:t>Framework</w:t>
+        <w:t>Studio</w:t>
       </w:r>
       <w:proofErr w:type="spellEnd"/>
       <w:r>
@@ -7003,7 +7394,7 @@
           <w:szCs w:val="28"/>
           <w:lang w:eastAsia="ru-RU"/>
         </w:rPr>
-        <w:t xml:space="preserve">, </w:t>
+        <w:t xml:space="preserve"> позволяет создавать и подключать сторонние дополнения (плагины) для расширения функциональности практически на каждом уровне, включая добавление поддержки систем контроля версий исходного кода (как, например, </w:t>
       </w:r>
       <w:proofErr w:type="spellStart"/>
       <w:r>
@@ -7012,7 +7403,7 @@
           <w:szCs w:val="28"/>
           <w:lang w:eastAsia="ru-RU"/>
         </w:rPr>
-        <w:t>Xbox</w:t>
+        <w:t>Subversion</w:t>
       </w:r>
       <w:proofErr w:type="spellEnd"/>
       <w:r>
@@ -7021,7 +7412,7 @@
           <w:szCs w:val="28"/>
           <w:lang w:eastAsia="ru-RU"/>
         </w:rPr>
-        <w:t xml:space="preserve">, </w:t>
+        <w:t xml:space="preserve"> и </w:t>
       </w:r>
       <w:proofErr w:type="spellStart"/>
       <w:r>
@@ -7030,7 +7421,7 @@
           <w:szCs w:val="28"/>
           <w:lang w:eastAsia="ru-RU"/>
         </w:rPr>
-        <w:t>Windows</w:t>
+        <w:t>Visual</w:t>
       </w:r>
       <w:proofErr w:type="spellEnd"/>
       <w:r>
@@ -7048,7 +7439,7 @@
           <w:szCs w:val="28"/>
           <w:lang w:eastAsia="ru-RU"/>
         </w:rPr>
-        <w:t>Phone</w:t>
+        <w:t>SourceSafe</w:t>
       </w:r>
       <w:proofErr w:type="spellEnd"/>
       <w:r>
@@ -7057,7 +7448,46 @@
           <w:szCs w:val="28"/>
           <w:lang w:eastAsia="ru-RU"/>
         </w:rPr>
-        <w:t xml:space="preserve">, .NET </w:t>
+        <w:t>), добавление новых наборов инструментов, например, для редактирования и визуального проектирования кода на предметно-ориентированных языках программирования или инструментов для прочих аспектов процесса разработки программного обеспечения</w:t>
+      </w:r>
+      <w:r>
+        <w:rPr>
+          <w:sz w:val="28"/>
+          <w:szCs w:val="28"/>
+          <w:lang w:eastAsia="ru-RU"/>
+        </w:rPr>
+        <w:t xml:space="preserve"> </w:t>
+      </w:r>
+      <w:r>
+        <w:rPr>
+          <w:sz w:val="28"/>
+          <w:szCs w:val="28"/>
+          <w:lang w:eastAsia="ru-RU"/>
+        </w:rPr>
+        <w:t>[2].</w:t>
+      </w:r>
+    </w:p>
+    <w:p>
+      <w:pPr>
+        <w:widowControl/>
+        <w:autoSpaceDE/>
+        <w:autoSpaceDN/>
+        <w:spacing w:line="360" w:lineRule="auto"/>
+        <w:ind w:firstLine="709"/>
+        <w:jc w:val="both"/>
+        <w:rPr>
+          <w:sz w:val="28"/>
+          <w:szCs w:val="28"/>
+          <w:lang w:eastAsia="ru-RU"/>
+        </w:rPr>
+      </w:pPr>
+      <w:r>
+        <w:rPr>
+          <w:sz w:val="28"/>
+          <w:szCs w:val="28"/>
+          <w:lang w:eastAsia="ru-RU"/>
+        </w:rPr>
+        <w:t xml:space="preserve"> </w:t>
       </w:r>
       <w:proofErr w:type="spellStart"/>
       <w:r>
@@ -7066,7 +7496,7 @@
           <w:szCs w:val="28"/>
           <w:lang w:eastAsia="ru-RU"/>
         </w:rPr>
-        <w:t>Compact</w:t>
+        <w:t>Visual</w:t>
       </w:r>
       <w:proofErr w:type="spellEnd"/>
       <w:r>
@@ -7084,7 +7514,7 @@
           <w:szCs w:val="28"/>
           <w:lang w:eastAsia="ru-RU"/>
         </w:rPr>
-        <w:t>Framework</w:t>
+        <w:t>Studio</w:t>
       </w:r>
       <w:proofErr w:type="spellEnd"/>
       <w:r>
@@ -7093,266 +7523,6 @@
           <w:szCs w:val="28"/>
           <w:lang w:eastAsia="ru-RU"/>
         </w:rPr>
-        <w:t xml:space="preserve"> и </w:t>
-      </w:r>
-      <w:proofErr w:type="spellStart"/>
-      <w:r>
-        <w:rPr>
-          <w:sz w:val="28"/>
-          <w:szCs w:val="28"/>
-          <w:lang w:eastAsia="ru-RU"/>
-        </w:rPr>
-        <w:t>Silverlight</w:t>
-      </w:r>
-      <w:proofErr w:type="spellEnd"/>
-      <w:r>
-        <w:rPr>
-          <w:sz w:val="28"/>
-          <w:szCs w:val="28"/>
-          <w:lang w:eastAsia="ru-RU"/>
-        </w:rPr>
-        <w:t>.</w:t>
-      </w:r>
-    </w:p>
-    <w:p>
-      <w:pPr>
-        <w:widowControl/>
-        <w:autoSpaceDE/>
-        <w:autoSpaceDN/>
-        <w:spacing w:line="360" w:lineRule="auto"/>
-        <w:ind w:firstLine="709"/>
-        <w:jc w:val="both"/>
-        <w:rPr>
-          <w:sz w:val="28"/>
-          <w:szCs w:val="28"/>
-          <w:lang w:eastAsia="ru-RU"/>
-        </w:rPr>
-      </w:pPr>
-      <w:r>
-        <w:rPr>
-          <w:sz w:val="28"/>
-          <w:szCs w:val="28"/>
-          <w:lang w:eastAsia="ru-RU"/>
-        </w:rPr>
-        <w:t xml:space="preserve"> </w:t>
-      </w:r>
-      <w:proofErr w:type="spellStart"/>
-      <w:r>
-        <w:rPr>
-          <w:sz w:val="28"/>
-          <w:szCs w:val="28"/>
-          <w:lang w:eastAsia="ru-RU"/>
-        </w:rPr>
-        <w:t>Visual</w:t>
-      </w:r>
-      <w:proofErr w:type="spellEnd"/>
-      <w:r>
-        <w:rPr>
-          <w:sz w:val="28"/>
-          <w:szCs w:val="28"/>
-          <w:lang w:eastAsia="ru-RU"/>
-        </w:rPr>
-        <w:t xml:space="preserve"> </w:t>
-      </w:r>
-      <w:proofErr w:type="spellStart"/>
-      <w:r>
-        <w:rPr>
-          <w:sz w:val="28"/>
-          <w:szCs w:val="28"/>
-          <w:lang w:eastAsia="ru-RU"/>
-        </w:rPr>
-        <w:t>Studio</w:t>
-      </w:r>
-      <w:proofErr w:type="spellEnd"/>
-      <w:r>
-        <w:rPr>
-          <w:sz w:val="28"/>
-          <w:szCs w:val="28"/>
-          <w:lang w:eastAsia="ru-RU"/>
-        </w:rPr>
-        <w:t xml:space="preserve"> включает в себя редактор исходного кода с поддержкой технологии </w:t>
-      </w:r>
-      <w:proofErr w:type="spellStart"/>
-      <w:r>
-        <w:rPr>
-          <w:sz w:val="28"/>
-          <w:szCs w:val="28"/>
-          <w:lang w:eastAsia="ru-RU"/>
-        </w:rPr>
-        <w:t>IntelliSense</w:t>
-      </w:r>
-      <w:proofErr w:type="spellEnd"/>
-      <w:r>
-        <w:rPr>
-          <w:sz w:val="28"/>
-          <w:szCs w:val="28"/>
-          <w:lang w:eastAsia="ru-RU"/>
-        </w:rPr>
-        <w:t xml:space="preserve"> и возможностью простейшего рефакторинга кода. Встроенный отладчик может работать как отладчик уровня исходного кода, так и как отладчик машинного уровня. Остальные встраиваемые инструменты включают в себя редактор форм для упрощения создания графического интерфейса приложения, веб-редактор, дизайнер классов и дизайнер схемы базы данных. </w:t>
-      </w:r>
-      <w:proofErr w:type="spellStart"/>
-      <w:r>
-        <w:rPr>
-          <w:sz w:val="28"/>
-          <w:szCs w:val="28"/>
-          <w:lang w:eastAsia="ru-RU"/>
-        </w:rPr>
-        <w:t>Visual</w:t>
-      </w:r>
-      <w:proofErr w:type="spellEnd"/>
-      <w:r>
-        <w:rPr>
-          <w:sz w:val="28"/>
-          <w:szCs w:val="28"/>
-          <w:lang w:eastAsia="ru-RU"/>
-        </w:rPr>
-        <w:t xml:space="preserve"> </w:t>
-      </w:r>
-      <w:proofErr w:type="spellStart"/>
-      <w:r>
-        <w:rPr>
-          <w:sz w:val="28"/>
-          <w:szCs w:val="28"/>
-          <w:lang w:eastAsia="ru-RU"/>
-        </w:rPr>
-        <w:t>Studio</w:t>
-      </w:r>
-      <w:proofErr w:type="spellEnd"/>
-      <w:r>
-        <w:rPr>
-          <w:sz w:val="28"/>
-          <w:szCs w:val="28"/>
-          <w:lang w:eastAsia="ru-RU"/>
-        </w:rPr>
-        <w:t xml:space="preserve"> позволяет создавать и подключать сторонние дополнения (плагины) для расширения функциональности практически на каждом уровне, включая добавление поддержки систем контроля версий исходного кода (как, например, </w:t>
-      </w:r>
-      <w:proofErr w:type="spellStart"/>
-      <w:r>
-        <w:rPr>
-          <w:sz w:val="28"/>
-          <w:szCs w:val="28"/>
-          <w:lang w:eastAsia="ru-RU"/>
-        </w:rPr>
-        <w:t>Subversion</w:t>
-      </w:r>
-      <w:proofErr w:type="spellEnd"/>
-      <w:r>
-        <w:rPr>
-          <w:sz w:val="28"/>
-          <w:szCs w:val="28"/>
-          <w:lang w:eastAsia="ru-RU"/>
-        </w:rPr>
-        <w:t xml:space="preserve"> и </w:t>
-      </w:r>
-      <w:proofErr w:type="spellStart"/>
-      <w:r>
-        <w:rPr>
-          <w:sz w:val="28"/>
-          <w:szCs w:val="28"/>
-          <w:lang w:eastAsia="ru-RU"/>
-        </w:rPr>
-        <w:t>Visual</w:t>
-      </w:r>
-      <w:proofErr w:type="spellEnd"/>
-      <w:r>
-        <w:rPr>
-          <w:sz w:val="28"/>
-          <w:szCs w:val="28"/>
-          <w:lang w:eastAsia="ru-RU"/>
-        </w:rPr>
-        <w:t xml:space="preserve"> </w:t>
-      </w:r>
-      <w:proofErr w:type="spellStart"/>
-      <w:r>
-        <w:rPr>
-          <w:sz w:val="28"/>
-          <w:szCs w:val="28"/>
-          <w:lang w:eastAsia="ru-RU"/>
-        </w:rPr>
-        <w:t>SourceSafe</w:t>
-      </w:r>
-      <w:proofErr w:type="spellEnd"/>
-      <w:r>
-        <w:rPr>
-          <w:sz w:val="28"/>
-          <w:szCs w:val="28"/>
-          <w:lang w:eastAsia="ru-RU"/>
-        </w:rPr>
-        <w:t>), добавление новых наборов инструментов, например, для редактирования и визуального проектирования кода на предметно-ориентированных языках программирования или инструментов для прочих аспектов процесса разработки программного обеспечения</w:t>
-      </w:r>
-      <w:r>
-        <w:rPr>
-          <w:sz w:val="28"/>
-          <w:szCs w:val="28"/>
-          <w:lang w:eastAsia="ru-RU"/>
-        </w:rPr>
-        <w:t xml:space="preserve"> </w:t>
-      </w:r>
-      <w:r>
-        <w:rPr>
-          <w:sz w:val="28"/>
-          <w:szCs w:val="28"/>
-          <w:lang w:eastAsia="ru-RU"/>
-        </w:rPr>
-        <w:t>[2].</w:t>
-      </w:r>
-    </w:p>
-    <w:p>
-      <w:pPr>
-        <w:widowControl/>
-        <w:autoSpaceDE/>
-        <w:autoSpaceDN/>
-        <w:spacing w:line="360" w:lineRule="auto"/>
-        <w:ind w:firstLine="709"/>
-        <w:jc w:val="both"/>
-        <w:rPr>
-          <w:sz w:val="28"/>
-          <w:szCs w:val="28"/>
-          <w:lang w:eastAsia="ru-RU"/>
-        </w:rPr>
-      </w:pPr>
-      <w:r>
-        <w:rPr>
-          <w:sz w:val="28"/>
-          <w:szCs w:val="28"/>
-          <w:lang w:eastAsia="ru-RU"/>
-        </w:rPr>
-        <w:t xml:space="preserve"> </w:t>
-      </w:r>
-      <w:proofErr w:type="spellStart"/>
-      <w:r>
-        <w:rPr>
-          <w:sz w:val="28"/>
-          <w:szCs w:val="28"/>
-          <w:lang w:eastAsia="ru-RU"/>
-        </w:rPr>
-        <w:t>Visual</w:t>
-      </w:r>
-      <w:proofErr w:type="spellEnd"/>
-      <w:r>
-        <w:rPr>
-          <w:sz w:val="28"/>
-          <w:szCs w:val="28"/>
-          <w:lang w:eastAsia="ru-RU"/>
-        </w:rPr>
-        <w:t xml:space="preserve"> </w:t>
-      </w:r>
-      <w:proofErr w:type="spellStart"/>
-      <w:r>
-        <w:rPr>
-          <w:sz w:val="28"/>
-          <w:szCs w:val="28"/>
-          <w:lang w:eastAsia="ru-RU"/>
-        </w:rPr>
-        <w:t>Studio</w:t>
-      </w:r>
-      <w:proofErr w:type="spellEnd"/>
-      <w:r>
-        <w:rPr>
-          <w:sz w:val="28"/>
-          <w:szCs w:val="28"/>
-          <w:lang w:eastAsia="ru-RU"/>
-        </w:rPr>
         <w:t xml:space="preserve"> построена на архитектуре, поддерживающей возможность использования встраиваемых дополнений - плагинов от сторонних разработчиков, что позволяет расширять возможности среды разработки.</w:t>
       </w:r>
     </w:p>
@@ -7569,7 +7739,6 @@
           <w:szCs w:val="28"/>
           <w:lang w:eastAsia="ru-RU"/>
         </w:rPr>
-        <w:lastRenderedPageBreak/>
         <w:t xml:space="preserve">2) </w:t>
       </w:r>
       <w:r>
@@ -7665,6 +7834,7 @@
           <w:szCs w:val="28"/>
           <w:lang w:eastAsia="ru-RU"/>
         </w:rPr>
+        <w:lastRenderedPageBreak/>
         <w:t xml:space="preserve">4) </w:t>
       </w:r>
       <w:r>
@@ -8198,7 +8368,6 @@
           <w:szCs w:val="28"/>
           <w:lang w:eastAsia="ru-RU"/>
         </w:rPr>
-        <w:lastRenderedPageBreak/>
         <w:t>4) у</w:t>
       </w:r>
       <w:r>
@@ -8317,6 +8486,7 @@
           <w:szCs w:val="28"/>
           <w:lang w:eastAsia="ru-RU"/>
         </w:rPr>
+        <w:lastRenderedPageBreak/>
         <w:t>у</w:t>
       </w:r>
       <w:r>
@@ -8597,7 +8767,30 @@
           <w:szCs w:val="28"/>
           <w:lang w:eastAsia="ru-RU"/>
         </w:rPr>
-        <w:t xml:space="preserve">Объектно-ориентированная разработка программной системы основана на стиле, называемом проектированием от данных. Проектирование системы сводится к поиску абстракций данных, подходящих для конкретной задачи. </w:t>
+        <w:t>Объектно-ориентированная разработка программной системы основана на стиле, называемом проектированием от данных. Проектирование системы сводится к поиску абстракций данных, подходящих для конкретной задачи. Каждая из таких абстракций реализуется в виде класса, которые и становятся модулями - архитектурными единицами построения нашей системы. В основе класса лежит абстрактный тип данных.</w:t>
+      </w:r>
+    </w:p>
+    <w:p>
+      <w:pPr>
+        <w:widowControl/>
+        <w:autoSpaceDE/>
+        <w:autoSpaceDN/>
+        <w:spacing w:line="360" w:lineRule="auto"/>
+        <w:ind w:firstLine="709"/>
+        <w:jc w:val="both"/>
+        <w:rPr>
+          <w:sz w:val="28"/>
+          <w:szCs w:val="28"/>
+          <w:lang w:eastAsia="ru-RU"/>
+        </w:rPr>
+      </w:pPr>
+      <w:r>
+        <w:rPr>
+          <w:sz w:val="28"/>
+          <w:szCs w:val="28"/>
+          <w:lang w:eastAsia="ru-RU"/>
+        </w:rPr>
+        <w:t xml:space="preserve">В хорошо спроектированной ОО-системе каждый класс играет обе роли, так что каждый модуль нашей системы имеет вполне определенную </w:t>
       </w:r>
       <w:r>
         <w:rPr>
@@ -8606,30 +8799,7 @@
           <w:lang w:eastAsia="ru-RU"/>
         </w:rPr>
         <w:lastRenderedPageBreak/>
-        <w:t>Каждая из таких абстракций реализуется в виде класса, которые и становятся модулями - архитектурными единицами построения нашей системы. В основе класса лежит абстрактный тип данных.</w:t>
-      </w:r>
-    </w:p>
-    <w:p>
-      <w:pPr>
-        <w:widowControl/>
-        <w:autoSpaceDE/>
-        <w:autoSpaceDN/>
-        <w:spacing w:line="360" w:lineRule="auto"/>
-        <w:ind w:firstLine="709"/>
-        <w:jc w:val="both"/>
-        <w:rPr>
-          <w:sz w:val="28"/>
-          <w:szCs w:val="28"/>
-          <w:lang w:eastAsia="ru-RU"/>
-        </w:rPr>
-      </w:pPr>
-      <w:r>
-        <w:rPr>
-          <w:sz w:val="28"/>
-          <w:szCs w:val="28"/>
-          <w:lang w:eastAsia="ru-RU"/>
-        </w:rPr>
-        <w:t>В хорошо спроектированной ОО-системе каждый класс играет обе роли, так что каждый модуль нашей системы имеет вполне определенную смысловую нагрузку. Типичная ошибка - рассматривать класс только как архитектурную единицу, объединяя под обложкой класса разнородные поля и функции, после чего становится неясным, какой же тип данных задает этот класс.</w:t>
+        <w:t>смысловую нагрузку. Типичная ошибка - рассматривать класс только как архитектурную единицу, объединяя под обложкой класса разнородные поля и функции, после чего становится неясным, какой же тип данных задает этот класс.</w:t>
       </w:r>
     </w:p>
     <w:p>
@@ -9130,8 +9300,34 @@
           <w:szCs w:val="28"/>
           <w:lang w:eastAsia="ru-RU"/>
         </w:rPr>
+        <w:t xml:space="preserve">Если поля доступны только для методов класса, то они имеют атрибут доступа </w:t>
+      </w:r>
+      <w:proofErr w:type="spellStart"/>
+      <w:r>
+        <w:rPr>
+          <w:sz w:val="28"/>
+          <w:szCs w:val="28"/>
+          <w:lang w:eastAsia="ru-RU"/>
+        </w:rPr>
+        <w:t>private</w:t>
+      </w:r>
+      <w:proofErr w:type="spellEnd"/>
+      <w:r>
+        <w:rPr>
+          <w:sz w:val="28"/>
+          <w:szCs w:val="28"/>
+          <w:lang w:eastAsia="ru-RU"/>
+        </w:rPr>
+        <w:t xml:space="preserve">, который можно опускать. Такие поля считаются закрытыми, но часто желательно, чтобы некоторые из них были доступны в более широком контексте. Если некоторые поля класса A должны быть доступны для методов класса B, являющегося потомком класса A, то эти поля следует </w:t>
+      </w:r>
+      <w:r>
+        <w:rPr>
+          <w:sz w:val="28"/>
+          <w:szCs w:val="28"/>
+          <w:lang w:eastAsia="ru-RU"/>
+        </w:rPr>
         <w:lastRenderedPageBreak/>
-        <w:t xml:space="preserve">Если поля доступны только для методов класса, то они имеют атрибут доступа </w:t>
+        <w:t xml:space="preserve">снабдить атрибутом </w:t>
       </w:r>
       <w:proofErr w:type="spellStart"/>
       <w:r>
@@ -9140,6 +9336,187 @@
           <w:szCs w:val="28"/>
           <w:lang w:eastAsia="ru-RU"/>
         </w:rPr>
+        <w:t>protected</w:t>
+      </w:r>
+      <w:proofErr w:type="spellEnd"/>
+      <w:r>
+        <w:rPr>
+          <w:sz w:val="28"/>
+          <w:szCs w:val="28"/>
+          <w:lang w:eastAsia="ru-RU"/>
+        </w:rPr>
+        <w:t xml:space="preserve">. Такие поля называются защищенными. Если некоторые поля должны быть доступны для методов классов B1, B2 и так далее, дружественных по отношению к классу A, то эти поля следует снабдить атрибутом </w:t>
+      </w:r>
+      <w:proofErr w:type="spellStart"/>
+      <w:r>
+        <w:rPr>
+          <w:sz w:val="28"/>
+          <w:szCs w:val="28"/>
+          <w:lang w:eastAsia="ru-RU"/>
+        </w:rPr>
+        <w:t>internal</w:t>
+      </w:r>
+      <w:proofErr w:type="spellEnd"/>
+      <w:r>
+        <w:rPr>
+          <w:sz w:val="28"/>
+          <w:szCs w:val="28"/>
+          <w:lang w:eastAsia="ru-RU"/>
+        </w:rPr>
+        <w:t>, а все дружественные классы B поместить в один проект (</w:t>
+      </w:r>
+      <w:proofErr w:type="spellStart"/>
+      <w:r>
+        <w:rPr>
+          <w:sz w:val="28"/>
+          <w:szCs w:val="28"/>
+          <w:lang w:eastAsia="ru-RU"/>
+        </w:rPr>
+        <w:t>assembly</w:t>
+      </w:r>
+      <w:proofErr w:type="spellEnd"/>
+      <w:r>
+        <w:rPr>
+          <w:sz w:val="28"/>
+          <w:szCs w:val="28"/>
+          <w:lang w:eastAsia="ru-RU"/>
+        </w:rPr>
+        <w:t xml:space="preserve">). Такие поля называются дружественными. Наконец, если некоторые поля должны быть доступны для методов любого класса B, которому доступен сам класс A, то эти поля следует снабдить атрибутом </w:t>
+      </w:r>
+      <w:proofErr w:type="spellStart"/>
+      <w:r>
+        <w:rPr>
+          <w:sz w:val="28"/>
+          <w:szCs w:val="28"/>
+          <w:lang w:eastAsia="ru-RU"/>
+        </w:rPr>
+        <w:t>public</w:t>
+      </w:r>
+      <w:proofErr w:type="spellEnd"/>
+      <w:r>
+        <w:rPr>
+          <w:sz w:val="28"/>
+          <w:szCs w:val="28"/>
+          <w:lang w:eastAsia="ru-RU"/>
+        </w:rPr>
+        <w:t>. Такие поля называются общедоступными или открытыми.</w:t>
+      </w:r>
+    </w:p>
+    <w:p>
+      <w:pPr>
+        <w:widowControl/>
+        <w:autoSpaceDE/>
+        <w:autoSpaceDN/>
+        <w:spacing w:line="360" w:lineRule="auto"/>
+        <w:ind w:firstLine="709"/>
+        <w:jc w:val="both"/>
+        <w:rPr>
+          <w:sz w:val="28"/>
+          <w:szCs w:val="28"/>
+          <w:lang w:eastAsia="ru-RU"/>
+        </w:rPr>
+      </w:pPr>
+    </w:p>
+    <w:p>
+      <w:pPr>
+        <w:widowControl/>
+        <w:autoSpaceDE/>
+        <w:autoSpaceDN/>
+        <w:spacing w:line="360" w:lineRule="auto"/>
+        <w:ind w:firstLine="709"/>
+        <w:jc w:val="both"/>
+        <w:rPr>
+          <w:sz w:val="28"/>
+          <w:szCs w:val="28"/>
+          <w:lang w:eastAsia="ru-RU"/>
+        </w:rPr>
+      </w:pPr>
+      <w:r>
+        <w:rPr>
+          <w:sz w:val="28"/>
+          <w:szCs w:val="28"/>
+          <w:lang w:eastAsia="ru-RU"/>
+        </w:rPr>
+        <w:t xml:space="preserve">1.6 </w:t>
+      </w:r>
+      <w:r>
+        <w:rPr>
+          <w:sz w:val="28"/>
+          <w:szCs w:val="28"/>
+          <w:lang w:eastAsia="ru-RU"/>
+        </w:rPr>
+        <w:t>Методы класса</w:t>
+      </w:r>
+    </w:p>
+    <w:p>
+      <w:pPr>
+        <w:widowControl/>
+        <w:autoSpaceDE/>
+        <w:autoSpaceDN/>
+        <w:spacing w:line="360" w:lineRule="auto"/>
+        <w:ind w:firstLine="709"/>
+        <w:jc w:val="both"/>
+        <w:rPr>
+          <w:sz w:val="28"/>
+          <w:szCs w:val="28"/>
+          <w:lang w:eastAsia="ru-RU"/>
+        </w:rPr>
+      </w:pPr>
+      <w:r>
+        <w:rPr>
+          <w:sz w:val="28"/>
+          <w:szCs w:val="28"/>
+          <w:lang w:eastAsia="ru-RU"/>
+        </w:rPr>
+        <w:t>Методы класса синтаксически являются обычными процедурами и функциями языка. Их описание удовлетворяет обычным правилам объявления процедур и функций. Методы содержат описания операций, доступных над объектами класса. Два объекта одного класса имеют один и тот же набор методов.</w:t>
+      </w:r>
+    </w:p>
+    <w:p>
+      <w:pPr>
+        <w:widowControl/>
+        <w:autoSpaceDE/>
+        <w:autoSpaceDN/>
+        <w:spacing w:line="360" w:lineRule="auto"/>
+        <w:jc w:val="both"/>
+        <w:rPr>
+          <w:sz w:val="28"/>
+          <w:szCs w:val="28"/>
+          <w:lang w:eastAsia="ru-RU"/>
+        </w:rPr>
+      </w:pPr>
+      <w:r>
+        <w:rPr>
+          <w:sz w:val="28"/>
+          <w:szCs w:val="28"/>
+          <w:lang w:eastAsia="ru-RU"/>
+        </w:rPr>
+        <w:t xml:space="preserve">Каждый метод имеет модификатор доступа, принимающий одно из четырех значений: </w:t>
+      </w:r>
+      <w:proofErr w:type="spellStart"/>
+      <w:r>
+        <w:rPr>
+          <w:sz w:val="28"/>
+          <w:szCs w:val="28"/>
+          <w:lang w:eastAsia="ru-RU"/>
+        </w:rPr>
+        <w:t>public</w:t>
+      </w:r>
+      <w:proofErr w:type="spellEnd"/>
+      <w:r>
+        <w:rPr>
+          <w:sz w:val="28"/>
+          <w:szCs w:val="28"/>
+          <w:lang w:eastAsia="ru-RU"/>
+        </w:rPr>
+        <w:t xml:space="preserve">, </w:t>
+      </w:r>
+      <w:proofErr w:type="spellStart"/>
+      <w:r>
+        <w:rPr>
+          <w:sz w:val="28"/>
+          <w:szCs w:val="28"/>
+          <w:lang w:eastAsia="ru-RU"/>
+        </w:rPr>
         <w:t>private</w:t>
       </w:r>
       <w:proofErr w:type="spellEnd"/>
@@ -9149,7 +9526,7 @@
           <w:szCs w:val="28"/>
           <w:lang w:eastAsia="ru-RU"/>
         </w:rPr>
-        <w:t xml:space="preserve">, который можно опускать. Такие поля считаются закрытыми, но часто желательно, чтобы некоторые из них были доступны в более широком контексте. Если некоторые поля класса A должны быть доступны для методов класса B, являющегося потомком класса A, то эти поля следует снабдить атрибутом </w:t>
+        <w:t xml:space="preserve">, </w:t>
       </w:r>
       <w:proofErr w:type="spellStart"/>
       <w:r>
@@ -9167,7 +9544,7 @@
           <w:szCs w:val="28"/>
           <w:lang w:eastAsia="ru-RU"/>
         </w:rPr>
-        <w:t xml:space="preserve">. Такие поля называются защищенными. Если некоторые поля должны быть доступны для методов классов B1, B2 и так далее, дружественных по отношению к классу A, то эти поля следует снабдить атрибутом </w:t>
+        <w:t xml:space="preserve">, </w:t>
       </w:r>
       <w:proofErr w:type="spellStart"/>
       <w:r>
@@ -9185,7 +9562,7 @@
           <w:szCs w:val="28"/>
           <w:lang w:eastAsia="ru-RU"/>
         </w:rPr>
-        <w:t>, а все дружественные классы B поместить в один проект (</w:t>
+        <w:t xml:space="preserve">. Атрибутом доступа по умолчанию является атрибут </w:t>
       </w:r>
       <w:proofErr w:type="spellStart"/>
       <w:r>
@@ -9194,7 +9571,7 @@
           <w:szCs w:val="28"/>
           <w:lang w:eastAsia="ru-RU"/>
         </w:rPr>
-        <w:t>assembly</w:t>
+        <w:t>private</w:t>
       </w:r>
       <w:proofErr w:type="spellEnd"/>
       <w:r>
@@ -9203,7 +9580,7 @@
           <w:szCs w:val="28"/>
           <w:lang w:eastAsia="ru-RU"/>
         </w:rPr>
-        <w:t xml:space="preserve">). Такие поля называются дружественными. Наконец, если некоторые поля должны быть доступны для методов любого класса B, которому доступен сам класс A, то эти поля следует снабдить атрибутом </w:t>
+        <w:t xml:space="preserve">. Независимо от значения атрибута доступа, все методы доступны для вызова при выполнении метода класса. Если методы имеют атрибут доступа </w:t>
       </w:r>
       <w:proofErr w:type="spellStart"/>
       <w:r>
@@ -9212,7 +9589,7 @@
           <w:szCs w:val="28"/>
           <w:lang w:eastAsia="ru-RU"/>
         </w:rPr>
-        <w:t>public</w:t>
+        <w:t>private</w:t>
       </w:r>
       <w:proofErr w:type="spellEnd"/>
       <w:r>
@@ -9221,205 +9598,6 @@
           <w:szCs w:val="28"/>
           <w:lang w:eastAsia="ru-RU"/>
         </w:rPr>
-        <w:t>. Такие поля называются общедоступными или открытыми.</w:t>
-      </w:r>
-    </w:p>
-    <w:p>
-      <w:pPr>
-        <w:widowControl/>
-        <w:autoSpaceDE/>
-        <w:autoSpaceDN/>
-        <w:spacing w:line="360" w:lineRule="auto"/>
-        <w:ind w:firstLine="709"/>
-        <w:jc w:val="both"/>
-        <w:rPr>
-          <w:sz w:val="28"/>
-          <w:szCs w:val="28"/>
-          <w:lang w:eastAsia="ru-RU"/>
-        </w:rPr>
-      </w:pPr>
-    </w:p>
-    <w:p>
-      <w:pPr>
-        <w:widowControl/>
-        <w:autoSpaceDE/>
-        <w:autoSpaceDN/>
-        <w:spacing w:line="360" w:lineRule="auto"/>
-        <w:ind w:firstLine="709"/>
-        <w:jc w:val="both"/>
-        <w:rPr>
-          <w:sz w:val="28"/>
-          <w:szCs w:val="28"/>
-          <w:lang w:eastAsia="ru-RU"/>
-        </w:rPr>
-      </w:pPr>
-      <w:r>
-        <w:rPr>
-          <w:sz w:val="28"/>
-          <w:szCs w:val="28"/>
-          <w:lang w:eastAsia="ru-RU"/>
-        </w:rPr>
-        <w:t xml:space="preserve">1.6 </w:t>
-      </w:r>
-      <w:r>
-        <w:rPr>
-          <w:sz w:val="28"/>
-          <w:szCs w:val="28"/>
-          <w:lang w:eastAsia="ru-RU"/>
-        </w:rPr>
-        <w:t>Методы класса</w:t>
-      </w:r>
-    </w:p>
-    <w:p>
-      <w:pPr>
-        <w:widowControl/>
-        <w:autoSpaceDE/>
-        <w:autoSpaceDN/>
-        <w:spacing w:line="360" w:lineRule="auto"/>
-        <w:ind w:firstLine="709"/>
-        <w:jc w:val="both"/>
-        <w:rPr>
-          <w:sz w:val="28"/>
-          <w:szCs w:val="28"/>
-          <w:lang w:eastAsia="ru-RU"/>
-        </w:rPr>
-      </w:pPr>
-      <w:r>
-        <w:rPr>
-          <w:sz w:val="28"/>
-          <w:szCs w:val="28"/>
-          <w:lang w:eastAsia="ru-RU"/>
-        </w:rPr>
-        <w:t>Методы класса синтаксически являются обычными процедурами и функциями языка. Их описание удовлетворяет обычным правилам объявления процедур и функций. Методы содержат описания операций, доступных над объектами класса. Два объекта одного класса имеют один и тот же набор методов.</w:t>
-      </w:r>
-    </w:p>
-    <w:p>
-      <w:pPr>
-        <w:widowControl/>
-        <w:autoSpaceDE/>
-        <w:autoSpaceDN/>
-        <w:spacing w:line="360" w:lineRule="auto"/>
-        <w:jc w:val="both"/>
-        <w:rPr>
-          <w:sz w:val="28"/>
-          <w:szCs w:val="28"/>
-          <w:lang w:eastAsia="ru-RU"/>
-        </w:rPr>
-      </w:pPr>
-      <w:r>
-        <w:rPr>
-          <w:sz w:val="28"/>
-          <w:szCs w:val="28"/>
-          <w:lang w:eastAsia="ru-RU"/>
-        </w:rPr>
-        <w:t xml:space="preserve">Каждый метод имеет модификатор доступа, принимающий одно из четырех значений: </w:t>
-      </w:r>
-      <w:proofErr w:type="spellStart"/>
-      <w:r>
-        <w:rPr>
-          <w:sz w:val="28"/>
-          <w:szCs w:val="28"/>
-          <w:lang w:eastAsia="ru-RU"/>
-        </w:rPr>
-        <w:t>public</w:t>
-      </w:r>
-      <w:proofErr w:type="spellEnd"/>
-      <w:r>
-        <w:rPr>
-          <w:sz w:val="28"/>
-          <w:szCs w:val="28"/>
-          <w:lang w:eastAsia="ru-RU"/>
-        </w:rPr>
-        <w:t xml:space="preserve">, </w:t>
-      </w:r>
-      <w:proofErr w:type="spellStart"/>
-      <w:r>
-        <w:rPr>
-          <w:sz w:val="28"/>
-          <w:szCs w:val="28"/>
-          <w:lang w:eastAsia="ru-RU"/>
-        </w:rPr>
-        <w:t>private</w:t>
-      </w:r>
-      <w:proofErr w:type="spellEnd"/>
-      <w:r>
-        <w:rPr>
-          <w:sz w:val="28"/>
-          <w:szCs w:val="28"/>
-          <w:lang w:eastAsia="ru-RU"/>
-        </w:rPr>
-        <w:t xml:space="preserve">, </w:t>
-      </w:r>
-      <w:proofErr w:type="spellStart"/>
-      <w:r>
-        <w:rPr>
-          <w:sz w:val="28"/>
-          <w:szCs w:val="28"/>
-          <w:lang w:eastAsia="ru-RU"/>
-        </w:rPr>
-        <w:t>protected</w:t>
-      </w:r>
-      <w:proofErr w:type="spellEnd"/>
-      <w:r>
-        <w:rPr>
-          <w:sz w:val="28"/>
-          <w:szCs w:val="28"/>
-          <w:lang w:eastAsia="ru-RU"/>
-        </w:rPr>
-        <w:t xml:space="preserve">, </w:t>
-      </w:r>
-      <w:proofErr w:type="spellStart"/>
-      <w:r>
-        <w:rPr>
-          <w:sz w:val="28"/>
-          <w:szCs w:val="28"/>
-          <w:lang w:eastAsia="ru-RU"/>
-        </w:rPr>
-        <w:t>internal</w:t>
-      </w:r>
-      <w:proofErr w:type="spellEnd"/>
-      <w:r>
-        <w:rPr>
-          <w:sz w:val="28"/>
-          <w:szCs w:val="28"/>
-          <w:lang w:eastAsia="ru-RU"/>
-        </w:rPr>
-        <w:t xml:space="preserve">. Атрибутом доступа по умолчанию является атрибут </w:t>
-      </w:r>
-      <w:proofErr w:type="spellStart"/>
-      <w:r>
-        <w:rPr>
-          <w:sz w:val="28"/>
-          <w:szCs w:val="28"/>
-          <w:lang w:eastAsia="ru-RU"/>
-        </w:rPr>
-        <w:t>private</w:t>
-      </w:r>
-      <w:proofErr w:type="spellEnd"/>
-      <w:r>
-        <w:rPr>
-          <w:sz w:val="28"/>
-          <w:szCs w:val="28"/>
-          <w:lang w:eastAsia="ru-RU"/>
-        </w:rPr>
-        <w:t xml:space="preserve">. Независимо от значения атрибута доступа, все методы доступны для вызова при выполнении метода класса. Если методы имеют атрибут доступа </w:t>
-      </w:r>
-      <w:proofErr w:type="spellStart"/>
-      <w:r>
-        <w:rPr>
-          <w:sz w:val="28"/>
-          <w:szCs w:val="28"/>
-          <w:lang w:eastAsia="ru-RU"/>
-        </w:rPr>
-        <w:t>private</w:t>
-      </w:r>
-      <w:proofErr w:type="spellEnd"/>
-      <w:r>
-        <w:rPr>
-          <w:sz w:val="28"/>
-          <w:szCs w:val="28"/>
-          <w:lang w:eastAsia="ru-RU"/>
-        </w:rPr>
         <w:t xml:space="preserve">, возможно, опущенный, то тогда они доступны только для вызова и только внутри методов самого класса. Такие методы считаются закрытыми. Понятно, что класс, у которого все методы закрыты, абсурден, поскольку никто не смог бы вызвать ни один из его методов. Как правило, у класса есть открытые методы, задающие интерфейс класса, и закрытые методы. Интерфейс </w:t>
       </w:r>
       <w:proofErr w:type="gramStart"/>
@@ -9438,7 +9616,7 @@
           <w:szCs w:val="28"/>
           <w:lang w:eastAsia="ru-RU"/>
         </w:rPr>
-        <w:t xml:space="preserve"> лицо класса и именно он определяет, чем </w:t>
+        <w:t xml:space="preserve"> лицо класса и именно он определяет, чем класс интересен своим клиентам, что он может делать, какие сервисы предоставляет клиентам. Закрытые методы составляют важную часть класса, позволяя клиентам не вникать во многие детали реализации. Эти методы клиентам класса недоступны, они о них могут ничего не знать, и, самое </w:t>
       </w:r>
       <w:r>
         <w:rPr>
@@ -9447,7 +9625,7 @@
           <w:lang w:eastAsia="ru-RU"/>
         </w:rPr>
         <w:lastRenderedPageBreak/>
-        <w:t>класс интересен своим клиентам, что он может делать, какие сервисы предоставляет клиентам. Закрытые методы составляют важную часть класса, позволяя клиентам не вникать во многие детали реализации. Эти методы клиентам класса недоступны, они о них могут ничего не знать, и, самое главное, изменения в закрытых методах никак не отражаются на клиентах класса при условии корректной работы открытых методов.</w:t>
+        <w:t>главное, изменения в закрытых методах никак не отражаются на клиентах класса при условии корректной работы открытых методов.</w:t>
       </w:r>
     </w:p>
     <w:p>
@@ -10057,7 +10235,162 @@
           <w:szCs w:val="28"/>
           <w:lang w:eastAsia="ru-RU"/>
         </w:rPr>
-        <w:t xml:space="preserve">) позволяет реализовать только первую стратегию. В языке C# принято, как и в других объектных языках, свойства объявлять закрытыми, а нужную стратегию доступа организовывать </w:t>
+        <w:t>) позволяет реализовать только первую стратегию. В языке C# принято, как и в других объектных языках, свойства объявлять закрытыми, а нужную стратегию доступа организовывать через методы. Для эффективности этого процесса и введены специальные методы-свойства.</w:t>
+      </w:r>
+    </w:p>
+    <w:p>
+      <w:pPr>
+        <w:widowControl/>
+        <w:autoSpaceDE/>
+        <w:autoSpaceDN/>
+        <w:spacing w:line="360" w:lineRule="auto"/>
+        <w:ind w:firstLine="709"/>
+        <w:jc w:val="both"/>
+        <w:rPr>
+          <w:sz w:val="28"/>
+          <w:szCs w:val="28"/>
+          <w:lang w:eastAsia="ru-RU"/>
+        </w:rPr>
+      </w:pPr>
+      <w:r>
+        <w:rPr>
+          <w:sz w:val="28"/>
+          <w:szCs w:val="28"/>
+          <w:lang w:eastAsia="ru-RU"/>
+        </w:rPr>
+        <w:t>В</w:t>
+      </w:r>
+      <w:r>
+        <w:rPr>
+          <w:sz w:val="28"/>
+          <w:szCs w:val="28"/>
+          <w:lang w:eastAsia="ru-RU"/>
+        </w:rPr>
+        <w:t xml:space="preserve">начале пример, а потом уточним синтаксис этих методов. </w:t>
+      </w:r>
+      <w:r>
+        <w:rPr>
+          <w:sz w:val="28"/>
+          <w:szCs w:val="28"/>
+          <w:lang w:eastAsia="ru-RU"/>
+        </w:rPr>
+        <w:t xml:space="preserve"> К</w:t>
+      </w:r>
+      <w:r>
+        <w:rPr>
+          <w:sz w:val="28"/>
+          <w:szCs w:val="28"/>
+          <w:lang w:eastAsia="ru-RU"/>
+        </w:rPr>
+        <w:t xml:space="preserve">ласс </w:t>
+      </w:r>
+      <w:proofErr w:type="spellStart"/>
+      <w:r>
+        <w:rPr>
+          <w:sz w:val="28"/>
+          <w:szCs w:val="28"/>
+          <w:lang w:eastAsia="ru-RU"/>
+        </w:rPr>
+        <w:t>Person</w:t>
+      </w:r>
+      <w:proofErr w:type="spellEnd"/>
+      <w:r>
+        <w:rPr>
+          <w:sz w:val="28"/>
+          <w:szCs w:val="28"/>
+          <w:lang w:eastAsia="ru-RU"/>
+        </w:rPr>
+        <w:t xml:space="preserve">, у которого пять полей: </w:t>
+      </w:r>
+      <w:proofErr w:type="spellStart"/>
+      <w:r>
+        <w:rPr>
+          <w:sz w:val="28"/>
+          <w:szCs w:val="28"/>
+          <w:lang w:eastAsia="ru-RU"/>
+        </w:rPr>
+        <w:t>fam</w:t>
+      </w:r>
+      <w:proofErr w:type="spellEnd"/>
+      <w:r>
+        <w:rPr>
+          <w:sz w:val="28"/>
+          <w:szCs w:val="28"/>
+          <w:lang w:eastAsia="ru-RU"/>
+        </w:rPr>
+        <w:t xml:space="preserve">, </w:t>
+      </w:r>
+      <w:proofErr w:type="spellStart"/>
+      <w:r>
+        <w:rPr>
+          <w:sz w:val="28"/>
+          <w:szCs w:val="28"/>
+          <w:lang w:eastAsia="ru-RU"/>
+        </w:rPr>
+        <w:t>status</w:t>
+      </w:r>
+      <w:proofErr w:type="spellEnd"/>
+      <w:r>
+        <w:rPr>
+          <w:sz w:val="28"/>
+          <w:szCs w:val="28"/>
+          <w:lang w:eastAsia="ru-RU"/>
+        </w:rPr>
+        <w:t xml:space="preserve">, </w:t>
+      </w:r>
+      <w:proofErr w:type="spellStart"/>
+      <w:r>
+        <w:rPr>
+          <w:sz w:val="28"/>
+          <w:szCs w:val="28"/>
+          <w:lang w:eastAsia="ru-RU"/>
+        </w:rPr>
+        <w:t>salary</w:t>
+      </w:r>
+      <w:proofErr w:type="spellEnd"/>
+      <w:r>
+        <w:rPr>
+          <w:sz w:val="28"/>
+          <w:szCs w:val="28"/>
+          <w:lang w:eastAsia="ru-RU"/>
+        </w:rPr>
+        <w:t xml:space="preserve">, </w:t>
+      </w:r>
+      <w:proofErr w:type="spellStart"/>
+      <w:r>
+        <w:rPr>
+          <w:sz w:val="28"/>
+          <w:szCs w:val="28"/>
+          <w:lang w:eastAsia="ru-RU"/>
+        </w:rPr>
+        <w:t>age</w:t>
+      </w:r>
+      <w:proofErr w:type="spellEnd"/>
+      <w:r>
+        <w:rPr>
+          <w:sz w:val="28"/>
+          <w:szCs w:val="28"/>
+          <w:lang w:eastAsia="ru-RU"/>
+        </w:rPr>
+        <w:t xml:space="preserve">, </w:t>
+      </w:r>
+      <w:proofErr w:type="spellStart"/>
+      <w:r>
+        <w:rPr>
+          <w:sz w:val="28"/>
+          <w:szCs w:val="28"/>
+          <w:lang w:eastAsia="ru-RU"/>
+        </w:rPr>
+        <w:t>health</w:t>
+      </w:r>
+      <w:proofErr w:type="spellEnd"/>
+      <w:r>
+        <w:rPr>
+          <w:sz w:val="28"/>
+          <w:szCs w:val="28"/>
+          <w:lang w:eastAsia="ru-RU"/>
+        </w:rPr>
+        <w:t xml:space="preserve">, характеризующих </w:t>
       </w:r>
       <w:r>
         <w:rPr>
@@ -10066,162 +10399,7 @@
           <w:lang w:eastAsia="ru-RU"/>
         </w:rPr>
         <w:lastRenderedPageBreak/>
-        <w:t>через методы. Для эффективности этого процесса и введены специальные методы-свойства.</w:t>
-      </w:r>
-    </w:p>
-    <w:p>
-      <w:pPr>
-        <w:widowControl/>
-        <w:autoSpaceDE/>
-        <w:autoSpaceDN/>
-        <w:spacing w:line="360" w:lineRule="auto"/>
-        <w:ind w:firstLine="709"/>
-        <w:jc w:val="both"/>
-        <w:rPr>
-          <w:sz w:val="28"/>
-          <w:szCs w:val="28"/>
-          <w:lang w:eastAsia="ru-RU"/>
-        </w:rPr>
-      </w:pPr>
-      <w:r>
-        <w:rPr>
-          <w:sz w:val="28"/>
-          <w:szCs w:val="28"/>
-          <w:lang w:eastAsia="ru-RU"/>
-        </w:rPr>
-        <w:t>В</w:t>
-      </w:r>
-      <w:r>
-        <w:rPr>
-          <w:sz w:val="28"/>
-          <w:szCs w:val="28"/>
-          <w:lang w:eastAsia="ru-RU"/>
-        </w:rPr>
-        <w:t xml:space="preserve">начале пример, а потом уточним синтаксис этих методов. </w:t>
-      </w:r>
-      <w:r>
-        <w:rPr>
-          <w:sz w:val="28"/>
-          <w:szCs w:val="28"/>
-          <w:lang w:eastAsia="ru-RU"/>
-        </w:rPr>
-        <w:t xml:space="preserve"> К</w:t>
-      </w:r>
-      <w:r>
-        <w:rPr>
-          <w:sz w:val="28"/>
-          <w:szCs w:val="28"/>
-          <w:lang w:eastAsia="ru-RU"/>
-        </w:rPr>
-        <w:t xml:space="preserve">ласс </w:t>
-      </w:r>
-      <w:proofErr w:type="spellStart"/>
-      <w:r>
-        <w:rPr>
-          <w:sz w:val="28"/>
-          <w:szCs w:val="28"/>
-          <w:lang w:eastAsia="ru-RU"/>
-        </w:rPr>
-        <w:t>Person</w:t>
-      </w:r>
-      <w:proofErr w:type="spellEnd"/>
-      <w:r>
-        <w:rPr>
-          <w:sz w:val="28"/>
-          <w:szCs w:val="28"/>
-          <w:lang w:eastAsia="ru-RU"/>
-        </w:rPr>
-        <w:t xml:space="preserve">, у которого пять полей: </w:t>
-      </w:r>
-      <w:proofErr w:type="spellStart"/>
-      <w:r>
-        <w:rPr>
-          <w:sz w:val="28"/>
-          <w:szCs w:val="28"/>
-          <w:lang w:eastAsia="ru-RU"/>
-        </w:rPr>
-        <w:t>fam</w:t>
-      </w:r>
-      <w:proofErr w:type="spellEnd"/>
-      <w:r>
-        <w:rPr>
-          <w:sz w:val="28"/>
-          <w:szCs w:val="28"/>
-          <w:lang w:eastAsia="ru-RU"/>
-        </w:rPr>
-        <w:t xml:space="preserve">, </w:t>
-      </w:r>
-      <w:proofErr w:type="spellStart"/>
-      <w:r>
-        <w:rPr>
-          <w:sz w:val="28"/>
-          <w:szCs w:val="28"/>
-          <w:lang w:eastAsia="ru-RU"/>
-        </w:rPr>
-        <w:t>status</w:t>
-      </w:r>
-      <w:proofErr w:type="spellEnd"/>
-      <w:r>
-        <w:rPr>
-          <w:sz w:val="28"/>
-          <w:szCs w:val="28"/>
-          <w:lang w:eastAsia="ru-RU"/>
-        </w:rPr>
-        <w:t xml:space="preserve">, </w:t>
-      </w:r>
-      <w:proofErr w:type="spellStart"/>
-      <w:r>
-        <w:rPr>
-          <w:sz w:val="28"/>
-          <w:szCs w:val="28"/>
-          <w:lang w:eastAsia="ru-RU"/>
-        </w:rPr>
-        <w:t>salary</w:t>
-      </w:r>
-      <w:proofErr w:type="spellEnd"/>
-      <w:r>
-        <w:rPr>
-          <w:sz w:val="28"/>
-          <w:szCs w:val="28"/>
-          <w:lang w:eastAsia="ru-RU"/>
-        </w:rPr>
-        <w:t xml:space="preserve">, </w:t>
-      </w:r>
-      <w:proofErr w:type="spellStart"/>
-      <w:r>
-        <w:rPr>
-          <w:sz w:val="28"/>
-          <w:szCs w:val="28"/>
-          <w:lang w:eastAsia="ru-RU"/>
-        </w:rPr>
-        <w:t>age</w:t>
-      </w:r>
-      <w:proofErr w:type="spellEnd"/>
-      <w:r>
-        <w:rPr>
-          <w:sz w:val="28"/>
-          <w:szCs w:val="28"/>
-          <w:lang w:eastAsia="ru-RU"/>
-        </w:rPr>
-        <w:t xml:space="preserve">, </w:t>
-      </w:r>
-      <w:proofErr w:type="spellStart"/>
-      <w:r>
-        <w:rPr>
-          <w:sz w:val="28"/>
-          <w:szCs w:val="28"/>
-          <w:lang w:eastAsia="ru-RU"/>
-        </w:rPr>
-        <w:t>health</w:t>
-      </w:r>
-      <w:proofErr w:type="spellEnd"/>
-      <w:r>
-        <w:rPr>
-          <w:sz w:val="28"/>
-          <w:szCs w:val="28"/>
-          <w:lang w:eastAsia="ru-RU"/>
-        </w:rPr>
-        <w:t>, характеризующих соответственно фамилию, статус, зарплату, возраст и здоровье персоны. Для каждого из этих полей может быть разумной своя стратегия доступа. Возраст доступен для чтения и записи, фамилию можно задать только один раз, статус можно только читать, зарплата недоступна для чтения, а здоровье закрыто для доступа и только специальные методы класса могут сообщать некоторую информацию о здоровье персоны. Вот как на C# можно обеспечить эти стратегии доступа к закрытым полям класса:</w:t>
+        <w:t>соответственно фамилию, статус, зарплату, возраст и здоровье персоны. Для каждого из этих полей может быть разумной своя стратегия доступа. Возраст доступен для чтения и записи, фамилию можно задать только один раз, статус можно только читать, зарплата недоступна для чтения, а здоровье закрыто для доступа и только специальные методы класса могут сообщать некоторую информацию о здоровье персоны. Вот как на C# можно обеспечить эти стратегии доступа к закрытым полям класса:</w:t>
       </w:r>
     </w:p>
     <w:p>
@@ -11037,6 +11215,178 @@
           <w:szCs w:val="24"/>
           <w:lang w:eastAsia="ru-RU"/>
         </w:rPr>
+        <w:tab/>
+      </w:r>
+      <w:r>
+        <w:rPr>
+          <w:sz w:val="24"/>
+          <w:szCs w:val="24"/>
+          <w:lang w:eastAsia="ru-RU"/>
+        </w:rPr>
+        <w:t>/// &lt;</w:t>
+      </w:r>
+      <w:proofErr w:type="spellStart"/>
+      <w:r>
+        <w:rPr>
+          <w:sz w:val="24"/>
+          <w:szCs w:val="24"/>
+          <w:lang w:eastAsia="ru-RU"/>
+        </w:rPr>
+        <w:t>summary</w:t>
+      </w:r>
+      <w:proofErr w:type="spellEnd"/>
+      <w:r>
+        <w:rPr>
+          <w:sz w:val="24"/>
+          <w:szCs w:val="24"/>
+          <w:lang w:eastAsia="ru-RU"/>
+        </w:rPr>
+        <w:t>&gt;</w:t>
+      </w:r>
+    </w:p>
+    <w:p>
+      <w:pPr>
+        <w:widowControl/>
+        <w:autoSpaceDE/>
+        <w:autoSpaceDN/>
+        <w:spacing w:line="360" w:lineRule="auto"/>
+        <w:ind w:firstLine="709"/>
+        <w:jc w:val="both"/>
+        <w:rPr>
+          <w:sz w:val="24"/>
+          <w:szCs w:val="24"/>
+          <w:lang w:eastAsia="ru-RU"/>
+        </w:rPr>
+      </w:pPr>
+      <w:r>
+        <w:rPr>
+          <w:sz w:val="24"/>
+          <w:szCs w:val="24"/>
+          <w:lang w:eastAsia="ru-RU"/>
+        </w:rPr>
+        <w:tab/>
+        <w:t xml:space="preserve">///стратегия: </w:t>
+      </w:r>
+      <w:proofErr w:type="spellStart"/>
+      <w:proofErr w:type="gramStart"/>
+      <w:r>
+        <w:rPr>
+          <w:sz w:val="24"/>
+          <w:szCs w:val="24"/>
+          <w:lang w:eastAsia="ru-RU"/>
+        </w:rPr>
+        <w:t>Read,Write</w:t>
+      </w:r>
+      <w:proofErr w:type="spellEnd"/>
+      <w:proofErr w:type="gramEnd"/>
+      <w:r>
+        <w:rPr>
+          <w:sz w:val="24"/>
+          <w:szCs w:val="24"/>
+          <w:lang w:eastAsia="ru-RU"/>
+        </w:rPr>
+        <w:t xml:space="preserve"> (Чтение, запись)</w:t>
+      </w:r>
+    </w:p>
+    <w:p>
+      <w:pPr>
+        <w:widowControl/>
+        <w:autoSpaceDE/>
+        <w:autoSpaceDN/>
+        <w:spacing w:line="360" w:lineRule="auto"/>
+        <w:ind w:firstLine="709"/>
+        <w:jc w:val="both"/>
+        <w:rPr>
+          <w:sz w:val="24"/>
+          <w:szCs w:val="24"/>
+          <w:lang w:val="en-US" w:eastAsia="ru-RU"/>
+        </w:rPr>
+      </w:pPr>
+      <w:r>
+        <w:rPr>
+          <w:sz w:val="24"/>
+          <w:szCs w:val="24"/>
+          <w:lang w:eastAsia="ru-RU"/>
+        </w:rPr>
+        <w:tab/>
+      </w:r>
+      <w:r>
+        <w:rPr>
+          <w:sz w:val="24"/>
+          <w:szCs w:val="24"/>
+          <w:lang w:val="en-US" w:eastAsia="ru-RU"/>
+        </w:rPr>
+        <w:t>/// &lt;/summary&gt;</w:t>
+      </w:r>
+    </w:p>
+    <w:p>
+      <w:pPr>
+        <w:widowControl/>
+        <w:autoSpaceDE/>
+        <w:autoSpaceDN/>
+        <w:spacing w:line="360" w:lineRule="auto"/>
+        <w:ind w:firstLine="709"/>
+        <w:jc w:val="both"/>
+        <w:rPr>
+          <w:sz w:val="24"/>
+          <w:szCs w:val="24"/>
+          <w:lang w:val="en-US" w:eastAsia="ru-RU"/>
+        </w:rPr>
+      </w:pPr>
+      <w:r>
+        <w:rPr>
+          <w:sz w:val="24"/>
+          <w:szCs w:val="24"/>
+          <w:lang w:val="en-US" w:eastAsia="ru-RU"/>
+        </w:rPr>
+        <w:tab/>
+        <w:t>public int Age</w:t>
+      </w:r>
+    </w:p>
+    <w:p>
+      <w:pPr>
+        <w:widowControl/>
+        <w:autoSpaceDE/>
+        <w:autoSpaceDN/>
+        <w:spacing w:line="360" w:lineRule="auto"/>
+        <w:ind w:firstLine="709"/>
+        <w:jc w:val="both"/>
+        <w:rPr>
+          <w:sz w:val="24"/>
+          <w:szCs w:val="24"/>
+          <w:lang w:val="en-US" w:eastAsia="ru-RU"/>
+        </w:rPr>
+      </w:pPr>
+      <w:r>
+        <w:rPr>
+          <w:sz w:val="24"/>
+          <w:szCs w:val="24"/>
+          <w:lang w:val="en-US" w:eastAsia="ru-RU"/>
+        </w:rPr>
+        <w:tab/>
+        <w:t>{</w:t>
+      </w:r>
+    </w:p>
+    <w:p>
+      <w:pPr>
+        <w:widowControl/>
+        <w:autoSpaceDE/>
+        <w:autoSpaceDN/>
+        <w:spacing w:line="360" w:lineRule="auto"/>
+        <w:ind w:firstLine="709"/>
+        <w:jc w:val="both"/>
+        <w:rPr>
+          <w:sz w:val="24"/>
+          <w:szCs w:val="24"/>
+          <w:lang w:val="en-US" w:eastAsia="ru-RU"/>
+        </w:rPr>
+      </w:pPr>
+      <w:r>
+        <w:rPr>
+          <w:sz w:val="24"/>
+          <w:szCs w:val="24"/>
+          <w:lang w:val="en-US" w:eastAsia="ru-RU"/>
+        </w:rPr>
         <w:lastRenderedPageBreak/>
         <w:tab/>
       </w:r>
@@ -11044,22 +11394,496 @@
         <w:rPr>
           <w:sz w:val="24"/>
           <w:szCs w:val="24"/>
-          <w:lang w:eastAsia="ru-RU"/>
-        </w:rPr>
+          <w:lang w:val="en-US" w:eastAsia="ru-RU"/>
+        </w:rPr>
+        <w:tab/>
+        <w:t>set</w:t>
+      </w:r>
+    </w:p>
+    <w:p>
+      <w:pPr>
+        <w:widowControl/>
+        <w:autoSpaceDE/>
+        <w:autoSpaceDN/>
+        <w:spacing w:line="360" w:lineRule="auto"/>
+        <w:ind w:firstLine="709"/>
+        <w:jc w:val="both"/>
+        <w:rPr>
+          <w:sz w:val="24"/>
+          <w:szCs w:val="24"/>
+          <w:lang w:val="en-US" w:eastAsia="ru-RU"/>
+        </w:rPr>
+      </w:pPr>
+      <w:r>
+        <w:rPr>
+          <w:sz w:val="24"/>
+          <w:szCs w:val="24"/>
+          <w:lang w:val="en-US" w:eastAsia="ru-RU"/>
+        </w:rPr>
+        <w:tab/>
+      </w:r>
+      <w:r>
+        <w:rPr>
+          <w:sz w:val="24"/>
+          <w:szCs w:val="24"/>
+          <w:lang w:val="en-US" w:eastAsia="ru-RU"/>
+        </w:rPr>
+        <w:tab/>
+        <w:t>{</w:t>
+      </w:r>
+    </w:p>
+    <w:p>
+      <w:pPr>
+        <w:widowControl/>
+        <w:autoSpaceDE/>
+        <w:autoSpaceDN/>
+        <w:spacing w:line="360" w:lineRule="auto"/>
+        <w:ind w:firstLine="709"/>
+        <w:jc w:val="both"/>
+        <w:rPr>
+          <w:sz w:val="24"/>
+          <w:szCs w:val="24"/>
+          <w:lang w:val="en-US" w:eastAsia="ru-RU"/>
+        </w:rPr>
+      </w:pPr>
+      <w:r>
+        <w:rPr>
+          <w:sz w:val="24"/>
+          <w:szCs w:val="24"/>
+          <w:lang w:val="en-US" w:eastAsia="ru-RU"/>
+        </w:rPr>
+        <w:tab/>
+      </w:r>
+      <w:r>
+        <w:rPr>
+          <w:sz w:val="24"/>
+          <w:szCs w:val="24"/>
+          <w:lang w:val="en-US" w:eastAsia="ru-RU"/>
+        </w:rPr>
+        <w:tab/>
+      </w:r>
+      <w:r>
+        <w:rPr>
+          <w:sz w:val="24"/>
+          <w:szCs w:val="24"/>
+          <w:lang w:val="en-US" w:eastAsia="ru-RU"/>
+        </w:rPr>
+        <w:tab/>
+        <w:t>age = value;</w:t>
+      </w:r>
+    </w:p>
+    <w:p>
+      <w:pPr>
+        <w:widowControl/>
+        <w:autoSpaceDE/>
+        <w:autoSpaceDN/>
+        <w:spacing w:line="360" w:lineRule="auto"/>
+        <w:ind w:firstLine="709"/>
+        <w:jc w:val="both"/>
+        <w:rPr>
+          <w:sz w:val="24"/>
+          <w:szCs w:val="24"/>
+          <w:lang w:val="en-US" w:eastAsia="ru-RU"/>
+        </w:rPr>
+      </w:pPr>
+      <w:r>
+        <w:rPr>
+          <w:sz w:val="24"/>
+          <w:szCs w:val="24"/>
+          <w:lang w:val="en-US" w:eastAsia="ru-RU"/>
+        </w:rPr>
+        <w:tab/>
+      </w:r>
+      <w:r>
+        <w:rPr>
+          <w:sz w:val="24"/>
+          <w:szCs w:val="24"/>
+          <w:lang w:val="en-US" w:eastAsia="ru-RU"/>
+        </w:rPr>
+        <w:tab/>
+      </w:r>
+      <w:r>
+        <w:rPr>
+          <w:sz w:val="24"/>
+          <w:szCs w:val="24"/>
+          <w:lang w:val="en-US" w:eastAsia="ru-RU"/>
+        </w:rPr>
+        <w:tab/>
+      </w:r>
+      <w:proofErr w:type="gramStart"/>
+      <w:r>
+        <w:rPr>
+          <w:sz w:val="24"/>
+          <w:szCs w:val="24"/>
+          <w:lang w:val="en-US" w:eastAsia="ru-RU"/>
+        </w:rPr>
+        <w:t>if(</w:t>
+      </w:r>
+      <w:proofErr w:type="gramEnd"/>
+      <w:r>
+        <w:rPr>
+          <w:sz w:val="24"/>
+          <w:szCs w:val="24"/>
+          <w:lang w:val="en-US" w:eastAsia="ru-RU"/>
+        </w:rPr>
+        <w:t>age &lt; 7)status ="</w:t>
+      </w:r>
+      <w:r>
+        <w:rPr>
+          <w:sz w:val="24"/>
+          <w:szCs w:val="24"/>
+          <w:lang w:eastAsia="ru-RU"/>
+        </w:rPr>
+        <w:t>ребенок</w:t>
+      </w:r>
+      <w:r>
+        <w:rPr>
+          <w:sz w:val="24"/>
+          <w:szCs w:val="24"/>
+          <w:lang w:val="en-US" w:eastAsia="ru-RU"/>
+        </w:rPr>
+        <w:t>";</w:t>
+      </w:r>
+    </w:p>
+    <w:p>
+      <w:pPr>
+        <w:widowControl/>
+        <w:autoSpaceDE/>
+        <w:autoSpaceDN/>
+        <w:spacing w:line="360" w:lineRule="auto"/>
+        <w:ind w:firstLine="709"/>
+        <w:jc w:val="both"/>
+        <w:rPr>
+          <w:sz w:val="24"/>
+          <w:szCs w:val="24"/>
+          <w:lang w:val="en-US" w:eastAsia="ru-RU"/>
+        </w:rPr>
+      </w:pPr>
+      <w:r>
+        <w:rPr>
+          <w:sz w:val="24"/>
+          <w:szCs w:val="24"/>
+          <w:lang w:val="en-US" w:eastAsia="ru-RU"/>
+        </w:rPr>
+        <w:tab/>
+      </w:r>
+      <w:r>
+        <w:rPr>
+          <w:sz w:val="24"/>
+          <w:szCs w:val="24"/>
+          <w:lang w:val="en-US" w:eastAsia="ru-RU"/>
+        </w:rPr>
+        <w:tab/>
+      </w:r>
+      <w:r>
+        <w:rPr>
+          <w:sz w:val="24"/>
+          <w:szCs w:val="24"/>
+          <w:lang w:val="en-US" w:eastAsia="ru-RU"/>
+        </w:rPr>
+        <w:tab/>
+        <w:t xml:space="preserve">else </w:t>
+      </w:r>
+      <w:proofErr w:type="gramStart"/>
+      <w:r>
+        <w:rPr>
+          <w:sz w:val="24"/>
+          <w:szCs w:val="24"/>
+          <w:lang w:val="en-US" w:eastAsia="ru-RU"/>
+        </w:rPr>
+        <w:t>if(</w:t>
+      </w:r>
+      <w:proofErr w:type="gramEnd"/>
+      <w:r>
+        <w:rPr>
+          <w:sz w:val="24"/>
+          <w:szCs w:val="24"/>
+          <w:lang w:val="en-US" w:eastAsia="ru-RU"/>
+        </w:rPr>
+        <w:t>age &lt;17)status ="</w:t>
+      </w:r>
+      <w:r>
+        <w:rPr>
+          <w:sz w:val="24"/>
+          <w:szCs w:val="24"/>
+          <w:lang w:eastAsia="ru-RU"/>
+        </w:rPr>
+        <w:t>школьник</w:t>
+      </w:r>
+      <w:r>
+        <w:rPr>
+          <w:sz w:val="24"/>
+          <w:szCs w:val="24"/>
+          <w:lang w:val="en-US" w:eastAsia="ru-RU"/>
+        </w:rPr>
+        <w:t>";</w:t>
+      </w:r>
+    </w:p>
+    <w:p>
+      <w:pPr>
+        <w:widowControl/>
+        <w:autoSpaceDE/>
+        <w:autoSpaceDN/>
+        <w:spacing w:line="360" w:lineRule="auto"/>
+        <w:ind w:firstLine="709"/>
+        <w:jc w:val="both"/>
+        <w:rPr>
+          <w:sz w:val="24"/>
+          <w:szCs w:val="24"/>
+          <w:lang w:val="en-US" w:eastAsia="ru-RU"/>
+        </w:rPr>
+      </w:pPr>
+      <w:r>
+        <w:rPr>
+          <w:sz w:val="24"/>
+          <w:szCs w:val="24"/>
+          <w:lang w:val="en-US" w:eastAsia="ru-RU"/>
+        </w:rPr>
+        <w:tab/>
+      </w:r>
+      <w:r>
+        <w:rPr>
+          <w:sz w:val="24"/>
+          <w:szCs w:val="24"/>
+          <w:lang w:val="en-US" w:eastAsia="ru-RU"/>
+        </w:rPr>
+        <w:tab/>
+      </w:r>
+      <w:r>
+        <w:rPr>
+          <w:sz w:val="24"/>
+          <w:szCs w:val="24"/>
+          <w:lang w:val="en-US" w:eastAsia="ru-RU"/>
+        </w:rPr>
+        <w:tab/>
+        <w:t xml:space="preserve">else if (age &lt; </w:t>
+      </w:r>
+      <w:proofErr w:type="gramStart"/>
+      <w:r>
+        <w:rPr>
+          <w:sz w:val="24"/>
+          <w:szCs w:val="24"/>
+          <w:lang w:val="en-US" w:eastAsia="ru-RU"/>
+        </w:rPr>
+        <w:t>22)status</w:t>
+      </w:r>
+      <w:proofErr w:type="gramEnd"/>
+      <w:r>
+        <w:rPr>
+          <w:sz w:val="24"/>
+          <w:szCs w:val="24"/>
+          <w:lang w:val="en-US" w:eastAsia="ru-RU"/>
+        </w:rPr>
+        <w:t xml:space="preserve"> = "</w:t>
+      </w:r>
+      <w:r>
+        <w:rPr>
+          <w:sz w:val="24"/>
+          <w:szCs w:val="24"/>
+          <w:lang w:eastAsia="ru-RU"/>
+        </w:rPr>
+        <w:t>студент</w:t>
+      </w:r>
+      <w:r>
+        <w:rPr>
+          <w:sz w:val="24"/>
+          <w:szCs w:val="24"/>
+          <w:lang w:val="en-US" w:eastAsia="ru-RU"/>
+        </w:rPr>
+        <w:t>";</w:t>
+      </w:r>
+    </w:p>
+    <w:p>
+      <w:pPr>
+        <w:widowControl/>
+        <w:autoSpaceDE/>
+        <w:autoSpaceDN/>
+        <w:spacing w:line="360" w:lineRule="auto"/>
+        <w:ind w:firstLine="709"/>
+        <w:jc w:val="both"/>
+        <w:rPr>
+          <w:sz w:val="24"/>
+          <w:szCs w:val="24"/>
+          <w:lang w:val="en-US" w:eastAsia="ru-RU"/>
+        </w:rPr>
+      </w:pPr>
+      <w:r>
+        <w:rPr>
+          <w:sz w:val="24"/>
+          <w:szCs w:val="24"/>
+          <w:lang w:val="en-US" w:eastAsia="ru-RU"/>
+        </w:rPr>
+        <w:tab/>
+      </w:r>
+      <w:r>
+        <w:rPr>
+          <w:sz w:val="24"/>
+          <w:szCs w:val="24"/>
+          <w:lang w:val="en-US" w:eastAsia="ru-RU"/>
+        </w:rPr>
+        <w:tab/>
+      </w:r>
+      <w:r>
+        <w:rPr>
+          <w:sz w:val="24"/>
+          <w:szCs w:val="24"/>
+          <w:lang w:val="en-US" w:eastAsia="ru-RU"/>
+        </w:rPr>
+        <w:tab/>
+        <w:t>else status = "</w:t>
+      </w:r>
+      <w:r>
+        <w:rPr>
+          <w:sz w:val="24"/>
+          <w:szCs w:val="24"/>
+          <w:lang w:eastAsia="ru-RU"/>
+        </w:rPr>
+        <w:t>служащий</w:t>
+      </w:r>
+      <w:r>
+        <w:rPr>
+          <w:sz w:val="24"/>
+          <w:szCs w:val="24"/>
+          <w:lang w:val="en-US" w:eastAsia="ru-RU"/>
+        </w:rPr>
+        <w:t>";</w:t>
+      </w:r>
+    </w:p>
+    <w:p>
+      <w:pPr>
+        <w:widowControl/>
+        <w:autoSpaceDE/>
+        <w:autoSpaceDN/>
+        <w:spacing w:line="360" w:lineRule="auto"/>
+        <w:ind w:firstLine="709"/>
+        <w:jc w:val="both"/>
+        <w:rPr>
+          <w:sz w:val="24"/>
+          <w:szCs w:val="24"/>
+          <w:lang w:val="en-US" w:eastAsia="ru-RU"/>
+        </w:rPr>
+      </w:pPr>
+      <w:r>
+        <w:rPr>
+          <w:sz w:val="24"/>
+          <w:szCs w:val="24"/>
+          <w:lang w:val="en-US" w:eastAsia="ru-RU"/>
+        </w:rPr>
+        <w:tab/>
+      </w:r>
+      <w:r>
+        <w:rPr>
+          <w:sz w:val="24"/>
+          <w:szCs w:val="24"/>
+          <w:lang w:val="en-US" w:eastAsia="ru-RU"/>
+        </w:rPr>
+        <w:tab/>
+        <w:t>}</w:t>
+      </w:r>
+    </w:p>
+    <w:p>
+      <w:pPr>
+        <w:widowControl/>
+        <w:autoSpaceDE/>
+        <w:autoSpaceDN/>
+        <w:spacing w:line="360" w:lineRule="auto"/>
+        <w:ind w:firstLine="709"/>
+        <w:jc w:val="both"/>
+        <w:rPr>
+          <w:sz w:val="24"/>
+          <w:szCs w:val="24"/>
+          <w:lang w:val="en-US" w:eastAsia="ru-RU"/>
+        </w:rPr>
+      </w:pPr>
+      <w:r>
+        <w:rPr>
+          <w:sz w:val="24"/>
+          <w:szCs w:val="24"/>
+          <w:lang w:val="en-US" w:eastAsia="ru-RU"/>
+        </w:rPr>
+        <w:tab/>
+      </w:r>
+      <w:r>
+        <w:rPr>
+          <w:sz w:val="24"/>
+          <w:szCs w:val="24"/>
+          <w:lang w:val="en-US" w:eastAsia="ru-RU"/>
+        </w:rPr>
+        <w:tab/>
+        <w:t>get {return(age);}</w:t>
+      </w:r>
+    </w:p>
+    <w:p>
+      <w:pPr>
+        <w:widowControl/>
+        <w:autoSpaceDE/>
+        <w:autoSpaceDN/>
+        <w:spacing w:line="360" w:lineRule="auto"/>
+        <w:ind w:firstLine="709"/>
+        <w:jc w:val="both"/>
+        <w:rPr>
+          <w:rFonts w:ascii="Arial" w:hAnsi="Arial" w:cs="Arial"/>
+          <w:sz w:val="24"/>
+          <w:szCs w:val="24"/>
+          <w:lang w:eastAsia="ru-RU"/>
+        </w:rPr>
+      </w:pPr>
+      <w:r>
+        <w:rPr>
+          <w:rFonts w:ascii="Arial" w:hAnsi="Arial" w:cs="Arial"/>
+          <w:sz w:val="24"/>
+          <w:szCs w:val="24"/>
+          <w:lang w:val="en-US" w:eastAsia="ru-RU"/>
+        </w:rPr>
+        <w:tab/>
+      </w:r>
+      <w:r>
+        <w:rPr>
+          <w:rFonts w:ascii="Arial" w:hAnsi="Arial" w:cs="Arial"/>
+          <w:sz w:val="24"/>
+          <w:szCs w:val="24"/>
+          <w:lang w:eastAsia="ru-RU"/>
+        </w:rPr>
+        <w:t>}</w:t>
+      </w:r>
+    </w:p>
+    <w:p>
+      <w:pPr>
+        <w:widowControl/>
+        <w:autoSpaceDE/>
+        <w:autoSpaceDN/>
+        <w:spacing w:line="360" w:lineRule="auto"/>
+        <w:ind w:firstLine="709"/>
+        <w:jc w:val="both"/>
+        <w:rPr>
+          <w:rFonts w:ascii="Arial" w:hAnsi="Arial" w:cs="Arial"/>
+          <w:sz w:val="24"/>
+          <w:szCs w:val="24"/>
+          <w:lang w:eastAsia="ru-RU"/>
+        </w:rPr>
+      </w:pPr>
+      <w:r>
+        <w:rPr>
+          <w:rFonts w:ascii="Arial" w:hAnsi="Arial" w:cs="Arial"/>
+          <w:sz w:val="24"/>
+          <w:szCs w:val="24"/>
+          <w:lang w:eastAsia="ru-RU"/>
+        </w:rPr>
+        <w:tab/>
         <w:t>/// &lt;</w:t>
       </w:r>
-      <w:proofErr w:type="spellStart"/>
-      <w:r>
-        <w:rPr>
-          <w:sz w:val="24"/>
-          <w:szCs w:val="24"/>
-          <w:lang w:eastAsia="ru-RU"/>
+      <w:r>
+        <w:rPr>
+          <w:rFonts w:ascii="Arial" w:hAnsi="Arial" w:cs="Arial"/>
+          <w:sz w:val="24"/>
+          <w:szCs w:val="24"/>
+          <w:lang w:val="en-US" w:eastAsia="ru-RU"/>
         </w:rPr>
         <w:t>summary</w:t>
       </w:r>
-      <w:proofErr w:type="spellEnd"/>
-      <w:r>
-        <w:rPr>
+      <w:r>
+        <w:rPr>
+          <w:rFonts w:ascii="Arial" w:hAnsi="Arial" w:cs="Arial"/>
           <w:sz w:val="24"/>
           <w:szCs w:val="24"/>
           <w:lang w:eastAsia="ru-RU"/>
@@ -11076,13 +11900,15 @@
         <w:ind w:firstLine="709"/>
         <w:jc w:val="both"/>
         <w:rPr>
-          <w:sz w:val="24"/>
-          <w:szCs w:val="24"/>
-          <w:lang w:eastAsia="ru-RU"/>
-        </w:rPr>
-      </w:pPr>
-      <w:r>
-        <w:rPr>
+          <w:rFonts w:ascii="Arial" w:hAnsi="Arial" w:cs="Arial"/>
+          <w:sz w:val="24"/>
+          <w:szCs w:val="24"/>
+          <w:lang w:eastAsia="ru-RU"/>
+        </w:rPr>
+      </w:pPr>
+      <w:r>
+        <w:rPr>
+          <w:rFonts w:ascii="Arial" w:hAnsi="Arial" w:cs="Arial"/>
           <w:sz w:val="24"/>
           <w:szCs w:val="24"/>
           <w:lang w:eastAsia="ru-RU"/>
@@ -11090,900 +11916,476 @@
         <w:tab/>
         <w:t xml:space="preserve">///стратегия: </w:t>
       </w:r>
+      <w:r>
+        <w:rPr>
+          <w:rFonts w:ascii="Arial" w:hAnsi="Arial" w:cs="Arial"/>
+          <w:sz w:val="24"/>
+          <w:szCs w:val="24"/>
+          <w:lang w:val="en-US" w:eastAsia="ru-RU"/>
+        </w:rPr>
+        <w:t>Write</w:t>
+      </w:r>
+      <w:r>
+        <w:rPr>
+          <w:rFonts w:ascii="Arial" w:hAnsi="Arial" w:cs="Arial"/>
+          <w:sz w:val="24"/>
+          <w:szCs w:val="24"/>
+          <w:lang w:eastAsia="ru-RU"/>
+        </w:rPr>
+        <w:t>-</w:t>
+      </w:r>
+      <w:r>
+        <w:rPr>
+          <w:rFonts w:ascii="Arial" w:hAnsi="Arial" w:cs="Arial"/>
+          <w:sz w:val="24"/>
+          <w:szCs w:val="24"/>
+          <w:lang w:val="en-US" w:eastAsia="ru-RU"/>
+        </w:rPr>
+        <w:t>only</w:t>
+      </w:r>
+      <w:r>
+        <w:rPr>
+          <w:rFonts w:ascii="Arial" w:hAnsi="Arial" w:cs="Arial"/>
+          <w:sz w:val="24"/>
+          <w:szCs w:val="24"/>
+          <w:lang w:eastAsia="ru-RU"/>
+        </w:rPr>
+        <w:t xml:space="preserve"> (Только запись)</w:t>
+      </w:r>
+    </w:p>
+    <w:p>
+      <w:pPr>
+        <w:widowControl/>
+        <w:autoSpaceDE/>
+        <w:autoSpaceDN/>
+        <w:spacing w:line="360" w:lineRule="auto"/>
+        <w:ind w:firstLine="709"/>
+        <w:jc w:val="both"/>
+        <w:rPr>
+          <w:rFonts w:ascii="Arial" w:hAnsi="Arial" w:cs="Arial"/>
+          <w:sz w:val="24"/>
+          <w:szCs w:val="24"/>
+          <w:lang w:val="en-US" w:eastAsia="ru-RU"/>
+        </w:rPr>
+      </w:pPr>
+      <w:r>
+        <w:rPr>
+          <w:rFonts w:ascii="Arial" w:hAnsi="Arial" w:cs="Arial"/>
+          <w:sz w:val="24"/>
+          <w:szCs w:val="24"/>
+          <w:lang w:eastAsia="ru-RU"/>
+        </w:rPr>
+        <w:tab/>
+      </w:r>
+      <w:r>
+        <w:rPr>
+          <w:rFonts w:ascii="Arial" w:hAnsi="Arial" w:cs="Arial"/>
+          <w:sz w:val="24"/>
+          <w:szCs w:val="24"/>
+          <w:lang w:val="en-US" w:eastAsia="ru-RU"/>
+        </w:rPr>
+        <w:t>/// &lt;/summary&gt;</w:t>
+      </w:r>
+    </w:p>
+    <w:p>
+      <w:pPr>
+        <w:widowControl/>
+        <w:autoSpaceDE/>
+        <w:autoSpaceDN/>
+        <w:spacing w:line="360" w:lineRule="auto"/>
+        <w:ind w:firstLine="709"/>
+        <w:jc w:val="both"/>
+        <w:rPr>
+          <w:rFonts w:ascii="Arial" w:hAnsi="Arial" w:cs="Arial"/>
+          <w:sz w:val="24"/>
+          <w:szCs w:val="24"/>
+          <w:lang w:val="en-US" w:eastAsia="ru-RU"/>
+        </w:rPr>
+      </w:pPr>
+      <w:r>
+        <w:rPr>
+          <w:rFonts w:ascii="Arial" w:hAnsi="Arial" w:cs="Arial"/>
+          <w:sz w:val="24"/>
+          <w:szCs w:val="24"/>
+          <w:lang w:val="en-US" w:eastAsia="ru-RU"/>
+        </w:rPr>
+        <w:tab/>
+        <w:t>public int Salary</w:t>
+      </w:r>
+    </w:p>
+    <w:p>
+      <w:pPr>
+        <w:widowControl/>
+        <w:autoSpaceDE/>
+        <w:autoSpaceDN/>
+        <w:spacing w:line="360" w:lineRule="auto"/>
+        <w:ind w:firstLine="709"/>
+        <w:jc w:val="both"/>
+        <w:rPr>
+          <w:rFonts w:ascii="Arial" w:hAnsi="Arial" w:cs="Arial"/>
+          <w:sz w:val="24"/>
+          <w:szCs w:val="24"/>
+          <w:lang w:val="en-US" w:eastAsia="ru-RU"/>
+        </w:rPr>
+      </w:pPr>
+      <w:r>
+        <w:rPr>
+          <w:rFonts w:ascii="Arial" w:hAnsi="Arial" w:cs="Arial"/>
+          <w:sz w:val="24"/>
+          <w:szCs w:val="24"/>
+          <w:lang w:val="en-US" w:eastAsia="ru-RU"/>
+        </w:rPr>
+        <w:tab/>
+        <w:t>{</w:t>
+      </w:r>
+    </w:p>
+    <w:p>
+      <w:pPr>
+        <w:widowControl/>
+        <w:autoSpaceDE/>
+        <w:autoSpaceDN/>
+        <w:spacing w:line="360" w:lineRule="auto"/>
+        <w:ind w:firstLine="709"/>
+        <w:jc w:val="both"/>
+        <w:rPr>
+          <w:rFonts w:ascii="Arial" w:hAnsi="Arial" w:cs="Arial"/>
+          <w:sz w:val="24"/>
+          <w:szCs w:val="24"/>
+          <w:lang w:val="en-US" w:eastAsia="ru-RU"/>
+        </w:rPr>
+      </w:pPr>
+      <w:r>
+        <w:rPr>
+          <w:rFonts w:ascii="Arial" w:hAnsi="Arial" w:cs="Arial"/>
+          <w:sz w:val="24"/>
+          <w:szCs w:val="24"/>
+          <w:lang w:val="en-US" w:eastAsia="ru-RU"/>
+        </w:rPr>
+        <w:tab/>
+      </w:r>
+      <w:r>
+        <w:rPr>
+          <w:rFonts w:ascii="Arial" w:hAnsi="Arial" w:cs="Arial"/>
+          <w:sz w:val="24"/>
+          <w:szCs w:val="24"/>
+          <w:lang w:val="en-US" w:eastAsia="ru-RU"/>
+        </w:rPr>
+        <w:tab/>
+        <w:t>set {salary = value;}</w:t>
+      </w:r>
+    </w:p>
+    <w:p>
+      <w:pPr>
+        <w:widowControl/>
+        <w:autoSpaceDE/>
+        <w:autoSpaceDN/>
+        <w:spacing w:line="360" w:lineRule="auto"/>
+        <w:ind w:firstLine="709"/>
+        <w:jc w:val="both"/>
+        <w:rPr>
+          <w:rFonts w:ascii="Arial" w:hAnsi="Arial" w:cs="Arial"/>
+          <w:sz w:val="24"/>
+          <w:szCs w:val="24"/>
+          <w:lang w:eastAsia="ru-RU"/>
+        </w:rPr>
+      </w:pPr>
+      <w:r>
+        <w:rPr>
+          <w:rFonts w:ascii="Arial" w:hAnsi="Arial" w:cs="Arial"/>
+          <w:sz w:val="24"/>
+          <w:szCs w:val="24"/>
+          <w:lang w:val="en-US" w:eastAsia="ru-RU"/>
+        </w:rPr>
+        <w:tab/>
+      </w:r>
+      <w:r>
+        <w:rPr>
+          <w:rFonts w:ascii="Arial" w:hAnsi="Arial" w:cs="Arial"/>
+          <w:sz w:val="24"/>
+          <w:szCs w:val="24"/>
+          <w:lang w:eastAsia="ru-RU"/>
+        </w:rPr>
+        <w:t>}</w:t>
+      </w:r>
+    </w:p>
+    <w:p>
+      <w:pPr>
+        <w:widowControl/>
+        <w:autoSpaceDE/>
+        <w:autoSpaceDN/>
+        <w:spacing w:line="360" w:lineRule="auto"/>
+        <w:ind w:firstLine="709"/>
+        <w:jc w:val="both"/>
+        <w:rPr>
+          <w:rFonts w:ascii="Arial" w:hAnsi="Arial" w:cs="Arial"/>
+          <w:sz w:val="24"/>
+          <w:szCs w:val="24"/>
+          <w:lang w:eastAsia="ru-RU"/>
+        </w:rPr>
+      </w:pPr>
+      <w:r>
+        <w:rPr>
+          <w:rFonts w:ascii="Arial" w:hAnsi="Arial" w:cs="Arial"/>
+          <w:sz w:val="24"/>
+          <w:szCs w:val="24"/>
+          <w:lang w:eastAsia="ru-RU"/>
+        </w:rPr>
+        <w:t>}</w:t>
+      </w:r>
+    </w:p>
+    <w:p>
+      <w:pPr>
+        <w:widowControl/>
+        <w:autoSpaceDE/>
+        <w:autoSpaceDN/>
+        <w:spacing w:line="360" w:lineRule="auto"/>
+        <w:ind w:firstLine="709"/>
+        <w:jc w:val="both"/>
+        <w:rPr>
+          <w:sz w:val="28"/>
+          <w:szCs w:val="28"/>
+          <w:lang w:eastAsia="ru-RU"/>
+        </w:rPr>
+      </w:pPr>
+      <w:r>
+        <w:rPr>
+          <w:sz w:val="28"/>
+          <w:szCs w:val="28"/>
+          <w:lang w:eastAsia="ru-RU"/>
+        </w:rPr>
+        <w:t>Т</w:t>
+      </w:r>
+      <w:r>
+        <w:rPr>
+          <w:sz w:val="28"/>
+          <w:szCs w:val="28"/>
+          <w:lang w:eastAsia="ru-RU"/>
+        </w:rPr>
+        <w:t xml:space="preserve">еперь общий синтаксис методов-свойств. Пусть </w:t>
+      </w:r>
+      <w:proofErr w:type="spellStart"/>
+      <w:r>
+        <w:rPr>
+          <w:sz w:val="28"/>
+          <w:szCs w:val="28"/>
+          <w:lang w:eastAsia="ru-RU"/>
+        </w:rPr>
+        <w:t>name</w:t>
+      </w:r>
+      <w:proofErr w:type="spellEnd"/>
+      <w:r>
+        <w:rPr>
+          <w:sz w:val="28"/>
+          <w:szCs w:val="28"/>
+          <w:lang w:eastAsia="ru-RU"/>
+        </w:rPr>
+        <w:t xml:space="preserve"> </w:t>
+      </w:r>
+      <w:r>
+        <w:rPr>
+          <w:color w:val="000000" w:themeColor="text1"/>
+          <w:sz w:val="28"/>
+          <w:szCs w:val="28"/>
+        </w:rPr>
+        <w:t xml:space="preserve">— </w:t>
+      </w:r>
+      <w:r>
+        <w:rPr>
+          <w:sz w:val="28"/>
+          <w:szCs w:val="28"/>
+          <w:lang w:eastAsia="ru-RU"/>
+        </w:rPr>
+        <w:t xml:space="preserve">это закрытое свойство. Тогда для него можно определить открытый метод-свойство (функцию), возвращающую тот же тип, что и поле </w:t>
+      </w:r>
+      <w:proofErr w:type="spellStart"/>
+      <w:r>
+        <w:rPr>
+          <w:sz w:val="28"/>
+          <w:szCs w:val="28"/>
+          <w:lang w:eastAsia="ru-RU"/>
+        </w:rPr>
+        <w:t>name</w:t>
+      </w:r>
+      <w:proofErr w:type="spellEnd"/>
+      <w:r>
+        <w:rPr>
+          <w:sz w:val="28"/>
+          <w:szCs w:val="28"/>
+          <w:lang w:eastAsia="ru-RU"/>
+        </w:rPr>
+        <w:t xml:space="preserve">. Имя метода обычно близко к имени поля (например, </w:t>
+      </w:r>
       <w:proofErr w:type="spellStart"/>
       <w:proofErr w:type="gramStart"/>
       <w:r>
         <w:rPr>
-          <w:sz w:val="24"/>
-          <w:szCs w:val="24"/>
-          <w:lang w:eastAsia="ru-RU"/>
-        </w:rPr>
-        <w:t>Read,Write</w:t>
+          <w:sz w:val="28"/>
+          <w:szCs w:val="28"/>
+          <w:lang w:eastAsia="ru-RU"/>
+        </w:rPr>
+        <w:t>Name</w:t>
       </w:r>
       <w:proofErr w:type="spellEnd"/>
+      <w:r>
+        <w:rPr>
+          <w:sz w:val="28"/>
+          <w:szCs w:val="28"/>
+          <w:lang w:eastAsia="ru-RU"/>
+        </w:rPr>
+        <w:t xml:space="preserve"> )</w:t>
+      </w:r>
       <w:proofErr w:type="gramEnd"/>
       <w:r>
         <w:rPr>
-          <w:sz w:val="24"/>
-          <w:szCs w:val="24"/>
-          <w:lang w:eastAsia="ru-RU"/>
-        </w:rPr>
-        <w:t xml:space="preserve"> (Чтение, запись)</w:t>
-      </w:r>
-    </w:p>
-    <w:p>
-      <w:pPr>
-        <w:widowControl/>
-        <w:autoSpaceDE/>
-        <w:autoSpaceDN/>
-        <w:spacing w:line="360" w:lineRule="auto"/>
-        <w:ind w:firstLine="709"/>
-        <w:jc w:val="both"/>
-        <w:rPr>
-          <w:sz w:val="24"/>
-          <w:szCs w:val="24"/>
-          <w:lang w:val="en-US" w:eastAsia="ru-RU"/>
-        </w:rPr>
-      </w:pPr>
-      <w:r>
-        <w:rPr>
-          <w:sz w:val="24"/>
-          <w:szCs w:val="24"/>
-          <w:lang w:eastAsia="ru-RU"/>
-        </w:rPr>
-        <w:tab/>
-      </w:r>
-      <w:r>
-        <w:rPr>
-          <w:sz w:val="24"/>
-          <w:szCs w:val="24"/>
-          <w:lang w:val="en-US" w:eastAsia="ru-RU"/>
-        </w:rPr>
-        <w:t>/// &lt;/summary&gt;</w:t>
-      </w:r>
-    </w:p>
-    <w:p>
-      <w:pPr>
-        <w:widowControl/>
-        <w:autoSpaceDE/>
-        <w:autoSpaceDN/>
-        <w:spacing w:line="360" w:lineRule="auto"/>
-        <w:ind w:firstLine="709"/>
-        <w:jc w:val="both"/>
-        <w:rPr>
-          <w:sz w:val="24"/>
-          <w:szCs w:val="24"/>
-          <w:lang w:val="en-US" w:eastAsia="ru-RU"/>
-        </w:rPr>
-      </w:pPr>
-      <w:r>
-        <w:rPr>
-          <w:sz w:val="24"/>
-          <w:szCs w:val="24"/>
-          <w:lang w:val="en-US" w:eastAsia="ru-RU"/>
-        </w:rPr>
-        <w:tab/>
-        <w:t>public int Age</w:t>
-      </w:r>
-    </w:p>
-    <w:p>
-      <w:pPr>
-        <w:widowControl/>
-        <w:autoSpaceDE/>
-        <w:autoSpaceDN/>
-        <w:spacing w:line="360" w:lineRule="auto"/>
-        <w:ind w:firstLine="709"/>
-        <w:jc w:val="both"/>
-        <w:rPr>
-          <w:sz w:val="24"/>
-          <w:szCs w:val="24"/>
-          <w:lang w:val="en-US" w:eastAsia="ru-RU"/>
-        </w:rPr>
-      </w:pPr>
-      <w:r>
-        <w:rPr>
-          <w:sz w:val="24"/>
-          <w:szCs w:val="24"/>
-          <w:lang w:val="en-US" w:eastAsia="ru-RU"/>
-        </w:rPr>
-        <w:tab/>
-        <w:t>{</w:t>
-      </w:r>
-    </w:p>
-    <w:p>
-      <w:pPr>
-        <w:widowControl/>
-        <w:autoSpaceDE/>
-        <w:autoSpaceDN/>
-        <w:spacing w:line="360" w:lineRule="auto"/>
-        <w:ind w:firstLine="709"/>
-        <w:jc w:val="both"/>
-        <w:rPr>
-          <w:sz w:val="24"/>
-          <w:szCs w:val="24"/>
-          <w:lang w:val="en-US" w:eastAsia="ru-RU"/>
-        </w:rPr>
-      </w:pPr>
-      <w:r>
-        <w:rPr>
-          <w:sz w:val="24"/>
-          <w:szCs w:val="24"/>
-          <w:lang w:val="en-US" w:eastAsia="ru-RU"/>
-        </w:rPr>
-        <w:tab/>
-      </w:r>
-      <w:r>
-        <w:rPr>
-          <w:sz w:val="24"/>
-          <w:szCs w:val="24"/>
-          <w:lang w:val="en-US" w:eastAsia="ru-RU"/>
-        </w:rPr>
-        <w:tab/>
+          <w:sz w:val="28"/>
+          <w:szCs w:val="28"/>
+          <w:lang w:eastAsia="ru-RU"/>
+        </w:rPr>
+        <w:t xml:space="preserve">. Тело свойства содержит два метода - </w:t>
+      </w:r>
+      <w:proofErr w:type="spellStart"/>
+      <w:r>
+        <w:rPr>
+          <w:sz w:val="28"/>
+          <w:szCs w:val="28"/>
+          <w:lang w:eastAsia="ru-RU"/>
+        </w:rPr>
+        <w:t>get</w:t>
+      </w:r>
+      <w:proofErr w:type="spellEnd"/>
+      <w:r>
+        <w:rPr>
+          <w:sz w:val="28"/>
+          <w:szCs w:val="28"/>
+          <w:lang w:eastAsia="ru-RU"/>
+        </w:rPr>
+        <w:t xml:space="preserve"> и </w:t>
+      </w:r>
+      <w:proofErr w:type="spellStart"/>
+      <w:r>
+        <w:rPr>
+          <w:sz w:val="28"/>
+          <w:szCs w:val="28"/>
+          <w:lang w:eastAsia="ru-RU"/>
+        </w:rPr>
         <w:t>set</w:t>
       </w:r>
-    </w:p>
-    <w:p>
-      <w:pPr>
-        <w:widowControl/>
-        <w:autoSpaceDE/>
-        <w:autoSpaceDN/>
-        <w:spacing w:line="360" w:lineRule="auto"/>
-        <w:ind w:firstLine="709"/>
-        <w:jc w:val="both"/>
-        <w:rPr>
-          <w:sz w:val="24"/>
-          <w:szCs w:val="24"/>
-          <w:lang w:val="en-US" w:eastAsia="ru-RU"/>
-        </w:rPr>
-      </w:pPr>
-      <w:r>
-        <w:rPr>
-          <w:sz w:val="24"/>
-          <w:szCs w:val="24"/>
-          <w:lang w:val="en-US" w:eastAsia="ru-RU"/>
-        </w:rPr>
-        <w:tab/>
-      </w:r>
-      <w:r>
-        <w:rPr>
-          <w:sz w:val="24"/>
-          <w:szCs w:val="24"/>
-          <w:lang w:val="en-US" w:eastAsia="ru-RU"/>
-        </w:rPr>
-        <w:tab/>
-        <w:t>{</w:t>
-      </w:r>
-    </w:p>
-    <w:p>
-      <w:pPr>
-        <w:widowControl/>
-        <w:autoSpaceDE/>
-        <w:autoSpaceDN/>
-        <w:spacing w:line="360" w:lineRule="auto"/>
-        <w:ind w:firstLine="709"/>
-        <w:jc w:val="both"/>
-        <w:rPr>
-          <w:sz w:val="24"/>
-          <w:szCs w:val="24"/>
-          <w:lang w:val="en-US" w:eastAsia="ru-RU"/>
-        </w:rPr>
-      </w:pPr>
-      <w:r>
-        <w:rPr>
-          <w:sz w:val="24"/>
-          <w:szCs w:val="24"/>
-          <w:lang w:val="en-US" w:eastAsia="ru-RU"/>
-        </w:rPr>
-        <w:tab/>
-      </w:r>
-      <w:r>
-        <w:rPr>
-          <w:sz w:val="24"/>
-          <w:szCs w:val="24"/>
-          <w:lang w:val="en-US" w:eastAsia="ru-RU"/>
-        </w:rPr>
-        <w:tab/>
-      </w:r>
-      <w:r>
-        <w:rPr>
-          <w:sz w:val="24"/>
-          <w:szCs w:val="24"/>
-          <w:lang w:val="en-US" w:eastAsia="ru-RU"/>
-        </w:rPr>
-        <w:tab/>
-        <w:t>age = value;</w:t>
-      </w:r>
-    </w:p>
-    <w:p>
-      <w:pPr>
-        <w:widowControl/>
-        <w:autoSpaceDE/>
-        <w:autoSpaceDN/>
-        <w:spacing w:line="360" w:lineRule="auto"/>
-        <w:ind w:firstLine="709"/>
-        <w:jc w:val="both"/>
-        <w:rPr>
-          <w:sz w:val="24"/>
-          <w:szCs w:val="24"/>
-          <w:lang w:val="en-US" w:eastAsia="ru-RU"/>
-        </w:rPr>
-      </w:pPr>
-      <w:r>
-        <w:rPr>
-          <w:sz w:val="24"/>
-          <w:szCs w:val="24"/>
-          <w:lang w:val="en-US" w:eastAsia="ru-RU"/>
-        </w:rPr>
-        <w:tab/>
-      </w:r>
-      <w:r>
-        <w:rPr>
-          <w:sz w:val="24"/>
-          <w:szCs w:val="24"/>
-          <w:lang w:val="en-US" w:eastAsia="ru-RU"/>
-        </w:rPr>
-        <w:tab/>
-      </w:r>
-      <w:r>
-        <w:rPr>
-          <w:sz w:val="24"/>
-          <w:szCs w:val="24"/>
-          <w:lang w:val="en-US" w:eastAsia="ru-RU"/>
-        </w:rPr>
-        <w:tab/>
+      <w:proofErr w:type="spellEnd"/>
+      <w:r>
+        <w:rPr>
+          <w:sz w:val="28"/>
+          <w:szCs w:val="28"/>
+          <w:lang w:eastAsia="ru-RU"/>
+        </w:rPr>
+        <w:t xml:space="preserve">, один из которых может быть опущен. Метод </w:t>
+      </w:r>
+      <w:proofErr w:type="spellStart"/>
+      <w:r>
+        <w:rPr>
+          <w:sz w:val="28"/>
+          <w:szCs w:val="28"/>
+          <w:lang w:eastAsia="ru-RU"/>
+        </w:rPr>
+        <w:t>get</w:t>
+      </w:r>
+      <w:proofErr w:type="spellEnd"/>
+      <w:r>
+        <w:rPr>
+          <w:sz w:val="28"/>
+          <w:szCs w:val="28"/>
+          <w:lang w:eastAsia="ru-RU"/>
+        </w:rPr>
+        <w:t xml:space="preserve"> возвращает значение закрытого поля, метод </w:t>
+      </w:r>
+      <w:proofErr w:type="spellStart"/>
+      <w:r>
+        <w:rPr>
+          <w:sz w:val="28"/>
+          <w:szCs w:val="28"/>
+          <w:lang w:eastAsia="ru-RU"/>
+        </w:rPr>
+        <w:t>set</w:t>
+      </w:r>
+      <w:proofErr w:type="spellEnd"/>
+      <w:r>
+        <w:rPr>
+          <w:sz w:val="28"/>
+          <w:szCs w:val="28"/>
+          <w:lang w:eastAsia="ru-RU"/>
+        </w:rPr>
+        <w:t xml:space="preserve"> - устанавливает значение, используя передаваемое ему значение в момент вызова, хранящееся в служебной переменной со стандартным именем </w:t>
+      </w:r>
+      <w:proofErr w:type="spellStart"/>
+      <w:r>
+        <w:rPr>
+          <w:sz w:val="28"/>
+          <w:szCs w:val="28"/>
+          <w:lang w:eastAsia="ru-RU"/>
+        </w:rPr>
+        <w:t>value</w:t>
+      </w:r>
+      <w:proofErr w:type="spellEnd"/>
+      <w:r>
+        <w:rPr>
+          <w:sz w:val="28"/>
+          <w:szCs w:val="28"/>
+          <w:lang w:eastAsia="ru-RU"/>
+        </w:rPr>
+        <w:t xml:space="preserve">. Поскольку </w:t>
+      </w:r>
+      <w:proofErr w:type="spellStart"/>
+      <w:r>
+        <w:rPr>
+          <w:sz w:val="28"/>
+          <w:szCs w:val="28"/>
+          <w:lang w:eastAsia="ru-RU"/>
+        </w:rPr>
+        <w:t>get</w:t>
+      </w:r>
+      <w:proofErr w:type="spellEnd"/>
+      <w:r>
+        <w:rPr>
+          <w:sz w:val="28"/>
+          <w:szCs w:val="28"/>
+          <w:lang w:eastAsia="ru-RU"/>
+        </w:rPr>
+        <w:t xml:space="preserve"> и </w:t>
+      </w:r>
+      <w:proofErr w:type="spellStart"/>
+      <w:r>
+        <w:rPr>
+          <w:sz w:val="28"/>
+          <w:szCs w:val="28"/>
+          <w:lang w:eastAsia="ru-RU"/>
+        </w:rPr>
+        <w:t>set</w:t>
+      </w:r>
+      <w:proofErr w:type="spellEnd"/>
+      <w:r>
+        <w:rPr>
+          <w:sz w:val="28"/>
+          <w:szCs w:val="28"/>
+          <w:lang w:eastAsia="ru-RU"/>
+        </w:rPr>
+        <w:t xml:space="preserve"> </w:t>
       </w:r>
       <w:proofErr w:type="gramStart"/>
       <w:r>
         <w:rPr>
-          <w:sz w:val="24"/>
-          <w:szCs w:val="24"/>
-          <w:lang w:val="en-US" w:eastAsia="ru-RU"/>
-        </w:rPr>
-        <w:t>if(</w:t>
+          <w:sz w:val="28"/>
+          <w:szCs w:val="28"/>
+          <w:lang w:eastAsia="ru-RU"/>
+        </w:rPr>
+        <w:t>- это</w:t>
       </w:r>
       <w:proofErr w:type="gramEnd"/>
       <w:r>
         <w:rPr>
-          <w:sz w:val="24"/>
-          <w:szCs w:val="24"/>
-          <w:lang w:val="en-US" w:eastAsia="ru-RU"/>
-        </w:rPr>
-        <w:t>age &lt; 7)status ="</w:t>
-      </w:r>
-      <w:r>
-        <w:rPr>
-          <w:sz w:val="24"/>
-          <w:szCs w:val="24"/>
-          <w:lang w:eastAsia="ru-RU"/>
-        </w:rPr>
-        <w:t>ребенок</w:t>
-      </w:r>
-      <w:r>
-        <w:rPr>
-          <w:sz w:val="24"/>
-          <w:szCs w:val="24"/>
-          <w:lang w:val="en-US" w:eastAsia="ru-RU"/>
-        </w:rPr>
-        <w:t>";</w:t>
-      </w:r>
-    </w:p>
-    <w:p>
-      <w:pPr>
-        <w:widowControl/>
-        <w:autoSpaceDE/>
-        <w:autoSpaceDN/>
-        <w:spacing w:line="360" w:lineRule="auto"/>
-        <w:ind w:firstLine="709"/>
-        <w:jc w:val="both"/>
-        <w:rPr>
-          <w:sz w:val="24"/>
-          <w:szCs w:val="24"/>
-          <w:lang w:val="en-US" w:eastAsia="ru-RU"/>
-        </w:rPr>
-      </w:pPr>
-      <w:r>
-        <w:rPr>
-          <w:sz w:val="24"/>
-          <w:szCs w:val="24"/>
-          <w:lang w:val="en-US" w:eastAsia="ru-RU"/>
-        </w:rPr>
-        <w:tab/>
-      </w:r>
-      <w:r>
-        <w:rPr>
-          <w:sz w:val="24"/>
-          <w:szCs w:val="24"/>
-          <w:lang w:val="en-US" w:eastAsia="ru-RU"/>
-        </w:rPr>
-        <w:tab/>
-      </w:r>
-      <w:r>
-        <w:rPr>
-          <w:sz w:val="24"/>
-          <w:szCs w:val="24"/>
-          <w:lang w:val="en-US" w:eastAsia="ru-RU"/>
-        </w:rPr>
-        <w:tab/>
-        <w:t xml:space="preserve">else </w:t>
-      </w:r>
-      <w:proofErr w:type="gramStart"/>
-      <w:r>
-        <w:rPr>
-          <w:sz w:val="24"/>
-          <w:szCs w:val="24"/>
-          <w:lang w:val="en-US" w:eastAsia="ru-RU"/>
-        </w:rPr>
-        <w:t>if(</w:t>
-      </w:r>
-      <w:proofErr w:type="gramEnd"/>
-      <w:r>
-        <w:rPr>
-          <w:sz w:val="24"/>
-          <w:szCs w:val="24"/>
-          <w:lang w:val="en-US" w:eastAsia="ru-RU"/>
-        </w:rPr>
-        <w:t>age &lt;17)status ="</w:t>
-      </w:r>
-      <w:r>
-        <w:rPr>
-          <w:sz w:val="24"/>
-          <w:szCs w:val="24"/>
-          <w:lang w:eastAsia="ru-RU"/>
-        </w:rPr>
-        <w:t>школьник</w:t>
-      </w:r>
-      <w:r>
-        <w:rPr>
-          <w:sz w:val="24"/>
-          <w:szCs w:val="24"/>
-          <w:lang w:val="en-US" w:eastAsia="ru-RU"/>
-        </w:rPr>
-        <w:t>";</w:t>
-      </w:r>
-    </w:p>
-    <w:p>
-      <w:pPr>
-        <w:widowControl/>
-        <w:autoSpaceDE/>
-        <w:autoSpaceDN/>
-        <w:spacing w:line="360" w:lineRule="auto"/>
-        <w:ind w:firstLine="709"/>
-        <w:jc w:val="both"/>
-        <w:rPr>
-          <w:sz w:val="24"/>
-          <w:szCs w:val="24"/>
-          <w:lang w:val="en-US" w:eastAsia="ru-RU"/>
-        </w:rPr>
-      </w:pPr>
-      <w:r>
-        <w:rPr>
-          <w:sz w:val="24"/>
-          <w:szCs w:val="24"/>
-          <w:lang w:val="en-US" w:eastAsia="ru-RU"/>
-        </w:rPr>
-        <w:tab/>
-      </w:r>
-      <w:r>
-        <w:rPr>
-          <w:sz w:val="24"/>
-          <w:szCs w:val="24"/>
-          <w:lang w:val="en-US" w:eastAsia="ru-RU"/>
-        </w:rPr>
-        <w:tab/>
-      </w:r>
-      <w:r>
-        <w:rPr>
-          <w:sz w:val="24"/>
-          <w:szCs w:val="24"/>
-          <w:lang w:val="en-US" w:eastAsia="ru-RU"/>
-        </w:rPr>
-        <w:tab/>
-        <w:t xml:space="preserve">else if (age &lt; </w:t>
-      </w:r>
-      <w:proofErr w:type="gramStart"/>
-      <w:r>
-        <w:rPr>
-          <w:sz w:val="24"/>
-          <w:szCs w:val="24"/>
-          <w:lang w:val="en-US" w:eastAsia="ru-RU"/>
-        </w:rPr>
-        <w:t>22)status</w:t>
-      </w:r>
-      <w:proofErr w:type="gramEnd"/>
-      <w:r>
-        <w:rPr>
-          <w:sz w:val="24"/>
-          <w:szCs w:val="24"/>
-          <w:lang w:val="en-US" w:eastAsia="ru-RU"/>
-        </w:rPr>
-        <w:t xml:space="preserve"> = "</w:t>
-      </w:r>
-      <w:r>
-        <w:rPr>
-          <w:sz w:val="24"/>
-          <w:szCs w:val="24"/>
-          <w:lang w:eastAsia="ru-RU"/>
-        </w:rPr>
-        <w:t>студент</w:t>
-      </w:r>
-      <w:r>
-        <w:rPr>
-          <w:sz w:val="24"/>
-          <w:szCs w:val="24"/>
-          <w:lang w:val="en-US" w:eastAsia="ru-RU"/>
-        </w:rPr>
-        <w:t>";</w:t>
-      </w:r>
-    </w:p>
-    <w:p>
-      <w:pPr>
-        <w:widowControl/>
-        <w:autoSpaceDE/>
-        <w:autoSpaceDN/>
-        <w:spacing w:line="360" w:lineRule="auto"/>
-        <w:ind w:firstLine="709"/>
-        <w:jc w:val="both"/>
-        <w:rPr>
-          <w:sz w:val="24"/>
-          <w:szCs w:val="24"/>
-          <w:lang w:val="en-US" w:eastAsia="ru-RU"/>
-        </w:rPr>
-      </w:pPr>
-      <w:r>
-        <w:rPr>
-          <w:sz w:val="24"/>
-          <w:szCs w:val="24"/>
-          <w:lang w:val="en-US" w:eastAsia="ru-RU"/>
-        </w:rPr>
-        <w:tab/>
-      </w:r>
-      <w:r>
-        <w:rPr>
-          <w:sz w:val="24"/>
-          <w:szCs w:val="24"/>
-          <w:lang w:val="en-US" w:eastAsia="ru-RU"/>
-        </w:rPr>
-        <w:tab/>
-      </w:r>
-      <w:r>
-        <w:rPr>
-          <w:sz w:val="24"/>
-          <w:szCs w:val="24"/>
-          <w:lang w:val="en-US" w:eastAsia="ru-RU"/>
-        </w:rPr>
-        <w:tab/>
-        <w:t>else status = "</w:t>
-      </w:r>
-      <w:r>
-        <w:rPr>
-          <w:sz w:val="24"/>
-          <w:szCs w:val="24"/>
-          <w:lang w:eastAsia="ru-RU"/>
-        </w:rPr>
-        <w:t>служащий</w:t>
-      </w:r>
-      <w:r>
-        <w:rPr>
-          <w:sz w:val="24"/>
-          <w:szCs w:val="24"/>
-          <w:lang w:val="en-US" w:eastAsia="ru-RU"/>
-        </w:rPr>
-        <w:t>";</w:t>
-      </w:r>
-    </w:p>
-    <w:p>
-      <w:pPr>
-        <w:widowControl/>
-        <w:autoSpaceDE/>
-        <w:autoSpaceDN/>
-        <w:spacing w:line="360" w:lineRule="auto"/>
-        <w:ind w:firstLine="709"/>
-        <w:jc w:val="both"/>
-        <w:rPr>
-          <w:sz w:val="24"/>
-          <w:szCs w:val="24"/>
-          <w:lang w:val="en-US" w:eastAsia="ru-RU"/>
-        </w:rPr>
-      </w:pPr>
-      <w:r>
-        <w:rPr>
-          <w:sz w:val="24"/>
-          <w:szCs w:val="24"/>
-          <w:lang w:val="en-US" w:eastAsia="ru-RU"/>
-        </w:rPr>
-        <w:tab/>
-      </w:r>
-      <w:r>
-        <w:rPr>
-          <w:sz w:val="24"/>
-          <w:szCs w:val="24"/>
-          <w:lang w:val="en-US" w:eastAsia="ru-RU"/>
-        </w:rPr>
-        <w:tab/>
-        <w:t>}</w:t>
-      </w:r>
-    </w:p>
-    <w:p>
-      <w:pPr>
-        <w:widowControl/>
-        <w:autoSpaceDE/>
-        <w:autoSpaceDN/>
-        <w:spacing w:line="360" w:lineRule="auto"/>
-        <w:ind w:firstLine="709"/>
-        <w:jc w:val="both"/>
-        <w:rPr>
-          <w:sz w:val="24"/>
-          <w:szCs w:val="24"/>
-          <w:lang w:val="en-US" w:eastAsia="ru-RU"/>
-        </w:rPr>
-      </w:pPr>
-      <w:r>
-        <w:rPr>
-          <w:sz w:val="24"/>
-          <w:szCs w:val="24"/>
-          <w:lang w:val="en-US" w:eastAsia="ru-RU"/>
-        </w:rPr>
-        <w:tab/>
-      </w:r>
-      <w:r>
-        <w:rPr>
-          <w:sz w:val="24"/>
-          <w:szCs w:val="24"/>
-          <w:lang w:val="en-US" w:eastAsia="ru-RU"/>
-        </w:rPr>
-        <w:tab/>
-        <w:t>get {return(age);}</w:t>
-      </w:r>
-    </w:p>
-    <w:p>
-      <w:pPr>
-        <w:widowControl/>
-        <w:autoSpaceDE/>
-        <w:autoSpaceDN/>
-        <w:spacing w:line="360" w:lineRule="auto"/>
-        <w:ind w:firstLine="709"/>
-        <w:jc w:val="both"/>
-        <w:rPr>
-          <w:rFonts w:ascii="Arial" w:hAnsi="Arial" w:cs="Arial"/>
-          <w:sz w:val="24"/>
-          <w:szCs w:val="24"/>
-          <w:lang w:eastAsia="ru-RU"/>
-        </w:rPr>
-      </w:pPr>
-      <w:r>
-        <w:rPr>
-          <w:rFonts w:ascii="Arial" w:hAnsi="Arial" w:cs="Arial"/>
-          <w:sz w:val="24"/>
-          <w:szCs w:val="24"/>
-          <w:lang w:val="en-US" w:eastAsia="ru-RU"/>
-        </w:rPr>
-        <w:tab/>
-      </w:r>
-      <w:r>
-        <w:rPr>
-          <w:rFonts w:ascii="Arial" w:hAnsi="Arial" w:cs="Arial"/>
-          <w:sz w:val="24"/>
-          <w:szCs w:val="24"/>
-          <w:lang w:eastAsia="ru-RU"/>
-        </w:rPr>
-        <w:t>}</w:t>
-      </w:r>
-    </w:p>
-    <w:p>
-      <w:pPr>
-        <w:widowControl/>
-        <w:autoSpaceDE/>
-        <w:autoSpaceDN/>
-        <w:spacing w:line="360" w:lineRule="auto"/>
-        <w:ind w:firstLine="709"/>
-        <w:jc w:val="both"/>
-        <w:rPr>
-          <w:rFonts w:ascii="Arial" w:hAnsi="Arial" w:cs="Arial"/>
-          <w:sz w:val="24"/>
-          <w:szCs w:val="24"/>
-          <w:lang w:eastAsia="ru-RU"/>
-        </w:rPr>
-      </w:pPr>
-      <w:r>
-        <w:rPr>
-          <w:rFonts w:ascii="Arial" w:hAnsi="Arial" w:cs="Arial"/>
-          <w:sz w:val="24"/>
-          <w:szCs w:val="24"/>
-          <w:lang w:eastAsia="ru-RU"/>
-        </w:rPr>
-        <w:tab/>
-        <w:t>/// &lt;</w:t>
-      </w:r>
-      <w:r>
-        <w:rPr>
-          <w:rFonts w:ascii="Arial" w:hAnsi="Arial" w:cs="Arial"/>
-          <w:sz w:val="24"/>
-          <w:szCs w:val="24"/>
-          <w:lang w:val="en-US" w:eastAsia="ru-RU"/>
-        </w:rPr>
-        <w:t>summary</w:t>
-      </w:r>
-      <w:r>
-        <w:rPr>
-          <w:rFonts w:ascii="Arial" w:hAnsi="Arial" w:cs="Arial"/>
-          <w:sz w:val="24"/>
-          <w:szCs w:val="24"/>
-          <w:lang w:eastAsia="ru-RU"/>
-        </w:rPr>
-        <w:t>&gt;</w:t>
-      </w:r>
-    </w:p>
-    <w:p>
-      <w:pPr>
-        <w:widowControl/>
-        <w:autoSpaceDE/>
-        <w:autoSpaceDN/>
-        <w:spacing w:line="360" w:lineRule="auto"/>
-        <w:ind w:firstLine="709"/>
-        <w:jc w:val="both"/>
-        <w:rPr>
-          <w:rFonts w:ascii="Arial" w:hAnsi="Arial" w:cs="Arial"/>
-          <w:sz w:val="24"/>
-          <w:szCs w:val="24"/>
-          <w:lang w:eastAsia="ru-RU"/>
-        </w:rPr>
-      </w:pPr>
-      <w:r>
-        <w:rPr>
-          <w:rFonts w:ascii="Arial" w:hAnsi="Arial" w:cs="Arial"/>
-          <w:sz w:val="24"/>
-          <w:szCs w:val="24"/>
-          <w:lang w:eastAsia="ru-RU"/>
-        </w:rPr>
-        <w:tab/>
-        <w:t xml:space="preserve">///стратегия: </w:t>
-      </w:r>
-      <w:r>
-        <w:rPr>
-          <w:rFonts w:ascii="Arial" w:hAnsi="Arial" w:cs="Arial"/>
-          <w:sz w:val="24"/>
-          <w:szCs w:val="24"/>
-          <w:lang w:val="en-US" w:eastAsia="ru-RU"/>
-        </w:rPr>
-        <w:t>Write</w:t>
-      </w:r>
-      <w:r>
-        <w:rPr>
-          <w:rFonts w:ascii="Arial" w:hAnsi="Arial" w:cs="Arial"/>
-          <w:sz w:val="24"/>
-          <w:szCs w:val="24"/>
-          <w:lang w:eastAsia="ru-RU"/>
-        </w:rPr>
-        <w:t>-</w:t>
-      </w:r>
-      <w:r>
-        <w:rPr>
-          <w:rFonts w:ascii="Arial" w:hAnsi="Arial" w:cs="Arial"/>
-          <w:sz w:val="24"/>
-          <w:szCs w:val="24"/>
-          <w:lang w:val="en-US" w:eastAsia="ru-RU"/>
-        </w:rPr>
-        <w:t>only</w:t>
-      </w:r>
-      <w:r>
-        <w:rPr>
-          <w:rFonts w:ascii="Arial" w:hAnsi="Arial" w:cs="Arial"/>
-          <w:sz w:val="24"/>
-          <w:szCs w:val="24"/>
-          <w:lang w:eastAsia="ru-RU"/>
-        </w:rPr>
-        <w:t xml:space="preserve"> (Только запись)</w:t>
-      </w:r>
-    </w:p>
-    <w:p>
-      <w:pPr>
-        <w:widowControl/>
-        <w:autoSpaceDE/>
-        <w:autoSpaceDN/>
-        <w:spacing w:line="360" w:lineRule="auto"/>
-        <w:ind w:firstLine="709"/>
-        <w:jc w:val="both"/>
-        <w:rPr>
-          <w:rFonts w:ascii="Arial" w:hAnsi="Arial" w:cs="Arial"/>
-          <w:sz w:val="24"/>
-          <w:szCs w:val="24"/>
-          <w:lang w:val="en-US" w:eastAsia="ru-RU"/>
-        </w:rPr>
-      </w:pPr>
-      <w:r>
-        <w:rPr>
-          <w:rFonts w:ascii="Arial" w:hAnsi="Arial" w:cs="Arial"/>
-          <w:sz w:val="24"/>
-          <w:szCs w:val="24"/>
-          <w:lang w:eastAsia="ru-RU"/>
-        </w:rPr>
-        <w:tab/>
-      </w:r>
-      <w:r>
-        <w:rPr>
-          <w:rFonts w:ascii="Arial" w:hAnsi="Arial" w:cs="Arial"/>
-          <w:sz w:val="24"/>
-          <w:szCs w:val="24"/>
-          <w:lang w:val="en-US" w:eastAsia="ru-RU"/>
-        </w:rPr>
-        <w:t>/// &lt;/summary&gt;</w:t>
-      </w:r>
-    </w:p>
-    <w:p>
-      <w:pPr>
-        <w:widowControl/>
-        <w:autoSpaceDE/>
-        <w:autoSpaceDN/>
-        <w:spacing w:line="360" w:lineRule="auto"/>
-        <w:ind w:firstLine="709"/>
-        <w:jc w:val="both"/>
-        <w:rPr>
-          <w:rFonts w:ascii="Arial" w:hAnsi="Arial" w:cs="Arial"/>
-          <w:sz w:val="24"/>
-          <w:szCs w:val="24"/>
-          <w:lang w:val="en-US" w:eastAsia="ru-RU"/>
-        </w:rPr>
-      </w:pPr>
-      <w:r>
-        <w:rPr>
-          <w:rFonts w:ascii="Arial" w:hAnsi="Arial" w:cs="Arial"/>
-          <w:sz w:val="24"/>
-          <w:szCs w:val="24"/>
-          <w:lang w:val="en-US" w:eastAsia="ru-RU"/>
-        </w:rPr>
-        <w:tab/>
-        <w:t>public int Salary</w:t>
-      </w:r>
-    </w:p>
-    <w:p>
-      <w:pPr>
-        <w:widowControl/>
-        <w:autoSpaceDE/>
-        <w:autoSpaceDN/>
-        <w:spacing w:line="360" w:lineRule="auto"/>
-        <w:ind w:firstLine="709"/>
-        <w:jc w:val="both"/>
-        <w:rPr>
-          <w:rFonts w:ascii="Arial" w:hAnsi="Arial" w:cs="Arial"/>
-          <w:sz w:val="24"/>
-          <w:szCs w:val="24"/>
-          <w:lang w:val="en-US" w:eastAsia="ru-RU"/>
-        </w:rPr>
-      </w:pPr>
-      <w:r>
-        <w:rPr>
-          <w:rFonts w:ascii="Arial" w:hAnsi="Arial" w:cs="Arial"/>
-          <w:sz w:val="24"/>
-          <w:szCs w:val="24"/>
-          <w:lang w:val="en-US" w:eastAsia="ru-RU"/>
-        </w:rPr>
-        <w:tab/>
-        <w:t>{</w:t>
-      </w:r>
-    </w:p>
-    <w:p>
-      <w:pPr>
-        <w:widowControl/>
-        <w:autoSpaceDE/>
-        <w:autoSpaceDN/>
-        <w:spacing w:line="360" w:lineRule="auto"/>
-        <w:ind w:firstLine="709"/>
-        <w:jc w:val="both"/>
-        <w:rPr>
-          <w:rFonts w:ascii="Arial" w:hAnsi="Arial" w:cs="Arial"/>
-          <w:sz w:val="24"/>
-          <w:szCs w:val="24"/>
-          <w:lang w:val="en-US" w:eastAsia="ru-RU"/>
-        </w:rPr>
-      </w:pPr>
-      <w:r>
-        <w:rPr>
-          <w:rFonts w:ascii="Arial" w:hAnsi="Arial" w:cs="Arial"/>
-          <w:sz w:val="24"/>
-          <w:szCs w:val="24"/>
-          <w:lang w:val="en-US" w:eastAsia="ru-RU"/>
-        </w:rPr>
-        <w:tab/>
-      </w:r>
-      <w:r>
-        <w:rPr>
-          <w:rFonts w:ascii="Arial" w:hAnsi="Arial" w:cs="Arial"/>
-          <w:sz w:val="24"/>
-          <w:szCs w:val="24"/>
-          <w:lang w:val="en-US" w:eastAsia="ru-RU"/>
-        </w:rPr>
-        <w:tab/>
-        <w:t>set {salary = value;}</w:t>
-      </w:r>
-    </w:p>
-    <w:p>
-      <w:pPr>
-        <w:widowControl/>
-        <w:autoSpaceDE/>
-        <w:autoSpaceDN/>
-        <w:spacing w:line="360" w:lineRule="auto"/>
-        <w:ind w:firstLine="709"/>
-        <w:jc w:val="both"/>
-        <w:rPr>
-          <w:rFonts w:ascii="Arial" w:hAnsi="Arial" w:cs="Arial"/>
-          <w:sz w:val="24"/>
-          <w:szCs w:val="24"/>
-          <w:lang w:eastAsia="ru-RU"/>
-        </w:rPr>
-      </w:pPr>
-      <w:r>
-        <w:rPr>
-          <w:rFonts w:ascii="Arial" w:hAnsi="Arial" w:cs="Arial"/>
-          <w:sz w:val="24"/>
-          <w:szCs w:val="24"/>
-          <w:lang w:val="en-US" w:eastAsia="ru-RU"/>
-        </w:rPr>
-        <w:tab/>
-      </w:r>
-      <w:r>
-        <w:rPr>
-          <w:rFonts w:ascii="Arial" w:hAnsi="Arial" w:cs="Arial"/>
-          <w:sz w:val="24"/>
-          <w:szCs w:val="24"/>
-          <w:lang w:eastAsia="ru-RU"/>
-        </w:rPr>
-        <w:t>}</w:t>
-      </w:r>
-    </w:p>
-    <w:p>
-      <w:pPr>
-        <w:widowControl/>
-        <w:autoSpaceDE/>
-        <w:autoSpaceDN/>
-        <w:spacing w:line="360" w:lineRule="auto"/>
-        <w:ind w:firstLine="709"/>
-        <w:jc w:val="both"/>
-        <w:rPr>
-          <w:rFonts w:ascii="Arial" w:hAnsi="Arial" w:cs="Arial"/>
-          <w:sz w:val="24"/>
-          <w:szCs w:val="24"/>
-          <w:lang w:eastAsia="ru-RU"/>
-        </w:rPr>
-      </w:pPr>
-      <w:r>
-        <w:rPr>
-          <w:rFonts w:ascii="Arial" w:hAnsi="Arial" w:cs="Arial"/>
-          <w:sz w:val="24"/>
-          <w:szCs w:val="24"/>
-          <w:lang w:eastAsia="ru-RU"/>
-        </w:rPr>
-        <w:t>}</w:t>
-      </w:r>
-    </w:p>
-    <w:p>
-      <w:pPr>
-        <w:widowControl/>
-        <w:autoSpaceDE/>
-        <w:autoSpaceDN/>
-        <w:spacing w:line="360" w:lineRule="auto"/>
-        <w:ind w:firstLine="709"/>
-        <w:jc w:val="both"/>
-        <w:rPr>
-          <w:sz w:val="28"/>
-          <w:szCs w:val="28"/>
-          <w:lang w:eastAsia="ru-RU"/>
-        </w:rPr>
-      </w:pPr>
-      <w:r>
-        <w:rPr>
-          <w:sz w:val="28"/>
-          <w:szCs w:val="28"/>
-          <w:lang w:eastAsia="ru-RU"/>
-        </w:rPr>
-        <w:t>Т</w:t>
-      </w:r>
-      <w:r>
-        <w:rPr>
-          <w:sz w:val="28"/>
-          <w:szCs w:val="28"/>
-          <w:lang w:eastAsia="ru-RU"/>
-        </w:rPr>
-        <w:t xml:space="preserve">еперь общий синтаксис методов-свойств. Пусть </w:t>
+          <w:sz w:val="28"/>
+          <w:szCs w:val="28"/>
+          <w:lang w:eastAsia="ru-RU"/>
+        </w:rPr>
+        <w:t xml:space="preserve"> обычные процедуры языка, то </w:t>
       </w:r>
       <w:proofErr w:type="spellStart"/>
       <w:r>
@@ -11992,7 +12394,7 @@
           <w:szCs w:val="28"/>
           <w:lang w:eastAsia="ru-RU"/>
         </w:rPr>
-        <w:t>name</w:t>
+        <w:t>программно</w:t>
       </w:r>
       <w:proofErr w:type="spellEnd"/>
       <w:r>
@@ -12001,320 +12403,88 @@
           <w:szCs w:val="28"/>
           <w:lang w:eastAsia="ru-RU"/>
         </w:rPr>
-        <w:t xml:space="preserve"> </w:t>
-      </w:r>
-      <w:r>
-        <w:rPr>
-          <w:color w:val="000000" w:themeColor="text1"/>
-          <w:sz w:val="28"/>
-          <w:szCs w:val="28"/>
-        </w:rPr>
-        <w:t xml:space="preserve">— </w:t>
-      </w:r>
-      <w:r>
-        <w:rPr>
-          <w:sz w:val="28"/>
-          <w:szCs w:val="28"/>
-          <w:lang w:eastAsia="ru-RU"/>
-        </w:rPr>
-        <w:t xml:space="preserve">это закрытое свойство. Тогда для него можно определить открытый метод-свойство (функцию), возвращающую тот же тип, что и поле </w:t>
-      </w:r>
-      <w:proofErr w:type="spellStart"/>
-      <w:r>
-        <w:rPr>
-          <w:sz w:val="28"/>
-          <w:szCs w:val="28"/>
-          <w:lang w:eastAsia="ru-RU"/>
-        </w:rPr>
-        <w:t>name</w:t>
-      </w:r>
-      <w:proofErr w:type="spellEnd"/>
-      <w:r>
-        <w:rPr>
-          <w:sz w:val="28"/>
-          <w:szCs w:val="28"/>
-          <w:lang w:eastAsia="ru-RU"/>
-        </w:rPr>
-        <w:t xml:space="preserve">. Имя метода обычно близко к имени поля (например, </w:t>
+        <w:t xml:space="preserve"> можно реализовать сколь угодно сложные стратегии доступа. В нашем примере фамилия меняется, только если ее значение равно пустой строке и это означает, что фамилия персоны ни разу еще не задавалась. Статус персоны пересчитывается автоматически при всяком изменении возраста, явно изменять его нельзя. Вот пример, показывающий, как некоторый клиент создает и работает с полями персоны</w:t>
+      </w:r>
+    </w:p>
+    <w:p>
+      <w:pPr>
+        <w:widowControl/>
+        <w:autoSpaceDE/>
+        <w:autoSpaceDN/>
+        <w:spacing w:line="360" w:lineRule="auto"/>
+        <w:ind w:firstLine="709"/>
+        <w:jc w:val="both"/>
+        <w:rPr>
+          <w:color w:val="FF0000"/>
+          <w:sz w:val="24"/>
+          <w:szCs w:val="24"/>
+          <w:lang w:val="en-US" w:eastAsia="ru-RU"/>
+        </w:rPr>
+      </w:pPr>
+      <w:r>
+        <w:rPr>
+          <w:color w:val="FF0000"/>
+          <w:sz w:val="24"/>
+          <w:szCs w:val="24"/>
+          <w:lang w:val="en-US" w:eastAsia="ru-RU"/>
+        </w:rPr>
+        <w:t xml:space="preserve">public void </w:t>
       </w:r>
       <w:proofErr w:type="spellStart"/>
       <w:proofErr w:type="gramStart"/>
       <w:r>
         <w:rPr>
-          <w:sz w:val="28"/>
-          <w:szCs w:val="28"/>
-          <w:lang w:eastAsia="ru-RU"/>
-        </w:rPr>
-        <w:t>Name</w:t>
+          <w:color w:val="FF0000"/>
+          <w:sz w:val="24"/>
+          <w:szCs w:val="24"/>
+          <w:lang w:val="en-US" w:eastAsia="ru-RU"/>
+        </w:rPr>
+        <w:t>TestPersonProps</w:t>
       </w:r>
       <w:proofErr w:type="spellEnd"/>
       <w:r>
         <w:rPr>
-          <w:sz w:val="28"/>
-          <w:szCs w:val="28"/>
-          <w:lang w:eastAsia="ru-RU"/>
-        </w:rPr>
-        <w:t xml:space="preserve"> )</w:t>
+          <w:color w:val="FF0000"/>
+          <w:sz w:val="24"/>
+          <w:szCs w:val="24"/>
+          <w:lang w:val="en-US" w:eastAsia="ru-RU"/>
+        </w:rPr>
+        <w:t>(</w:t>
       </w:r>
       <w:proofErr w:type="gramEnd"/>
       <w:r>
         <w:rPr>
-          <w:sz w:val="28"/>
-          <w:szCs w:val="28"/>
-          <w:lang w:eastAsia="ru-RU"/>
-        </w:rPr>
-        <w:t xml:space="preserve">. Тело свойства содержит два метода - </w:t>
-      </w:r>
-      <w:proofErr w:type="spellStart"/>
-      <w:r>
-        <w:rPr>
-          <w:sz w:val="28"/>
-          <w:szCs w:val="28"/>
-          <w:lang w:eastAsia="ru-RU"/>
-        </w:rPr>
-        <w:t>get</w:t>
-      </w:r>
-      <w:proofErr w:type="spellEnd"/>
-      <w:r>
-        <w:rPr>
-          <w:sz w:val="28"/>
-          <w:szCs w:val="28"/>
-          <w:lang w:eastAsia="ru-RU"/>
-        </w:rPr>
-        <w:t xml:space="preserve"> и </w:t>
-      </w:r>
-      <w:proofErr w:type="spellStart"/>
-      <w:r>
-        <w:rPr>
-          <w:sz w:val="28"/>
-          <w:szCs w:val="28"/>
-          <w:lang w:eastAsia="ru-RU"/>
-        </w:rPr>
-        <w:t>set</w:t>
-      </w:r>
-      <w:proofErr w:type="spellEnd"/>
-      <w:r>
-        <w:rPr>
-          <w:sz w:val="28"/>
-          <w:szCs w:val="28"/>
-          <w:lang w:eastAsia="ru-RU"/>
-        </w:rPr>
-        <w:t xml:space="preserve">, один из которых может быть опущен. Метод </w:t>
-      </w:r>
-      <w:proofErr w:type="spellStart"/>
-      <w:r>
-        <w:rPr>
-          <w:sz w:val="28"/>
-          <w:szCs w:val="28"/>
-          <w:lang w:eastAsia="ru-RU"/>
-        </w:rPr>
-        <w:t>get</w:t>
-      </w:r>
-      <w:proofErr w:type="spellEnd"/>
-      <w:r>
-        <w:rPr>
-          <w:sz w:val="28"/>
-          <w:szCs w:val="28"/>
-          <w:lang w:eastAsia="ru-RU"/>
-        </w:rPr>
-        <w:t xml:space="preserve"> возвращает значение закрытого поля, метод </w:t>
-      </w:r>
-      <w:proofErr w:type="spellStart"/>
-      <w:r>
-        <w:rPr>
-          <w:sz w:val="28"/>
-          <w:szCs w:val="28"/>
-          <w:lang w:eastAsia="ru-RU"/>
-        </w:rPr>
-        <w:t>set</w:t>
-      </w:r>
-      <w:proofErr w:type="spellEnd"/>
-      <w:r>
-        <w:rPr>
-          <w:sz w:val="28"/>
-          <w:szCs w:val="28"/>
-          <w:lang w:eastAsia="ru-RU"/>
-        </w:rPr>
-        <w:t xml:space="preserve"> - устанавливает значение, используя передаваемое ему значение в момент вызова, хранящееся в служебной переменной со стандартным именем </w:t>
-      </w:r>
-      <w:proofErr w:type="spellStart"/>
-      <w:r>
-        <w:rPr>
-          <w:sz w:val="28"/>
-          <w:szCs w:val="28"/>
-          <w:lang w:eastAsia="ru-RU"/>
-        </w:rPr>
-        <w:t>value</w:t>
-      </w:r>
-      <w:proofErr w:type="spellEnd"/>
-      <w:r>
-        <w:rPr>
-          <w:sz w:val="28"/>
-          <w:szCs w:val="28"/>
-          <w:lang w:eastAsia="ru-RU"/>
-        </w:rPr>
-        <w:t xml:space="preserve">. Поскольку </w:t>
-      </w:r>
-      <w:proofErr w:type="spellStart"/>
-      <w:r>
-        <w:rPr>
-          <w:sz w:val="28"/>
-          <w:szCs w:val="28"/>
-          <w:lang w:eastAsia="ru-RU"/>
-        </w:rPr>
-        <w:t>get</w:t>
-      </w:r>
-      <w:proofErr w:type="spellEnd"/>
-      <w:r>
-        <w:rPr>
-          <w:sz w:val="28"/>
-          <w:szCs w:val="28"/>
-          <w:lang w:eastAsia="ru-RU"/>
-        </w:rPr>
-        <w:t xml:space="preserve"> и </w:t>
-      </w:r>
-      <w:proofErr w:type="spellStart"/>
-      <w:r>
-        <w:rPr>
-          <w:sz w:val="28"/>
-          <w:szCs w:val="28"/>
-          <w:lang w:eastAsia="ru-RU"/>
-        </w:rPr>
-        <w:t>set</w:t>
-      </w:r>
-      <w:proofErr w:type="spellEnd"/>
-      <w:r>
-        <w:rPr>
-          <w:sz w:val="28"/>
-          <w:szCs w:val="28"/>
-          <w:lang w:eastAsia="ru-RU"/>
-        </w:rPr>
-        <w:t xml:space="preserve"> </w:t>
-      </w:r>
-      <w:proofErr w:type="gramStart"/>
-      <w:r>
-        <w:rPr>
-          <w:sz w:val="28"/>
-          <w:szCs w:val="28"/>
-          <w:lang w:eastAsia="ru-RU"/>
-        </w:rPr>
-        <w:t>- это</w:t>
-      </w:r>
-      <w:proofErr w:type="gramEnd"/>
-      <w:r>
-        <w:rPr>
-          <w:sz w:val="28"/>
-          <w:szCs w:val="28"/>
-          <w:lang w:eastAsia="ru-RU"/>
-        </w:rPr>
-        <w:t xml:space="preserve"> обычные процедуры языка, то </w:t>
-      </w:r>
-      <w:proofErr w:type="spellStart"/>
-      <w:r>
-        <w:rPr>
-          <w:sz w:val="28"/>
-          <w:szCs w:val="28"/>
-          <w:lang w:eastAsia="ru-RU"/>
-        </w:rPr>
-        <w:t>программно</w:t>
-      </w:r>
-      <w:proofErr w:type="spellEnd"/>
-      <w:r>
-        <w:rPr>
-          <w:sz w:val="28"/>
-          <w:szCs w:val="28"/>
-          <w:lang w:eastAsia="ru-RU"/>
-        </w:rPr>
-        <w:t xml:space="preserve"> можно реализовать сколь угодно сложные стратегии доступа. В нашем примере фамилия меняется, только если ее значение равно </w:t>
-      </w:r>
-      <w:r>
-        <w:rPr>
-          <w:sz w:val="28"/>
-          <w:szCs w:val="28"/>
-          <w:lang w:eastAsia="ru-RU"/>
+          <w:color w:val="FF0000"/>
+          <w:sz w:val="24"/>
+          <w:szCs w:val="24"/>
+          <w:lang w:val="en-US" w:eastAsia="ru-RU"/>
+        </w:rPr>
+        <w:t>)</w:t>
+      </w:r>
+    </w:p>
+    <w:p>
+      <w:pPr>
+        <w:widowControl/>
+        <w:autoSpaceDE/>
+        <w:autoSpaceDN/>
+        <w:spacing w:line="360" w:lineRule="auto"/>
+        <w:ind w:firstLine="709"/>
+        <w:jc w:val="both"/>
+        <w:rPr>
+          <w:color w:val="FF0000"/>
+          <w:sz w:val="24"/>
+          <w:szCs w:val="24"/>
+          <w:lang w:val="en-US" w:eastAsia="ru-RU"/>
+        </w:rPr>
+      </w:pPr>
+      <w:r>
+        <w:rPr>
+          <w:color w:val="FF0000"/>
+          <w:sz w:val="24"/>
+          <w:szCs w:val="24"/>
+          <w:lang w:val="en-US" w:eastAsia="ru-RU"/>
         </w:rPr>
         <w:lastRenderedPageBreak/>
-        <w:t>пустой строке и это означает, что фамилия персоны ни разу еще не задавалась. Статус персоны пересчитывается автоматически при всяком изменении возраста, явно изменять его нельзя. Вот пример, показывающий, как некоторый клиент создает и работает с полями персоны</w:t>
-      </w:r>
-    </w:p>
-    <w:p>
-      <w:pPr>
-        <w:widowControl/>
-        <w:autoSpaceDE/>
-        <w:autoSpaceDN/>
-        <w:spacing w:line="360" w:lineRule="auto"/>
-        <w:ind w:firstLine="709"/>
-        <w:jc w:val="both"/>
-        <w:rPr>
-          <w:color w:val="FF0000"/>
-          <w:sz w:val="24"/>
-          <w:szCs w:val="24"/>
-          <w:lang w:val="en-US" w:eastAsia="ru-RU"/>
-        </w:rPr>
-      </w:pPr>
-      <w:r>
-        <w:rPr>
-          <w:color w:val="FF0000"/>
-          <w:sz w:val="24"/>
-          <w:szCs w:val="24"/>
-          <w:lang w:val="en-US" w:eastAsia="ru-RU"/>
-        </w:rPr>
-        <w:t xml:space="preserve">public void </w:t>
-      </w:r>
-      <w:proofErr w:type="spellStart"/>
-      <w:proofErr w:type="gramStart"/>
-      <w:r>
-        <w:rPr>
-          <w:color w:val="FF0000"/>
-          <w:sz w:val="24"/>
-          <w:szCs w:val="24"/>
-          <w:lang w:val="en-US" w:eastAsia="ru-RU"/>
-        </w:rPr>
-        <w:t>TestPersonProps</w:t>
-      </w:r>
-      <w:proofErr w:type="spellEnd"/>
-      <w:r>
-        <w:rPr>
-          <w:color w:val="FF0000"/>
-          <w:sz w:val="24"/>
-          <w:szCs w:val="24"/>
-          <w:lang w:val="en-US" w:eastAsia="ru-RU"/>
-        </w:rPr>
-        <w:t>(</w:t>
-      </w:r>
-      <w:proofErr w:type="gramEnd"/>
-      <w:r>
-        <w:rPr>
-          <w:color w:val="FF0000"/>
-          <w:sz w:val="24"/>
-          <w:szCs w:val="24"/>
-          <w:lang w:val="en-US" w:eastAsia="ru-RU"/>
-        </w:rPr>
-        <w:t>)</w:t>
-      </w:r>
-    </w:p>
-    <w:p>
-      <w:pPr>
-        <w:widowControl/>
-        <w:autoSpaceDE/>
-        <w:autoSpaceDN/>
-        <w:spacing w:line="360" w:lineRule="auto"/>
-        <w:ind w:firstLine="709"/>
-        <w:jc w:val="both"/>
-        <w:rPr>
-          <w:color w:val="FF0000"/>
-          <w:sz w:val="24"/>
-          <w:szCs w:val="24"/>
-          <w:lang w:val="en-US" w:eastAsia="ru-RU"/>
-        </w:rPr>
-      </w:pPr>
-      <w:r>
-        <w:rPr>
-          <w:color w:val="FF0000"/>
-          <w:sz w:val="24"/>
-          <w:szCs w:val="24"/>
-          <w:lang w:val="en-US" w:eastAsia="ru-RU"/>
-        </w:rPr>
         <w:t>{</w:t>
       </w:r>
     </w:p>
@@ -13084,7 +13254,84 @@
           <w:szCs w:val="28"/>
           <w:lang w:eastAsia="ru-RU"/>
         </w:rPr>
-        <w:t xml:space="preserve"> базируется на событийной модели, что позволяет эффективно обрабатывать действия пользователя. Нажатия кнопок, изменения значений </w:t>
+        <w:t xml:space="preserve"> базируется на событийной модели, что позволяет эффективно обрабатывать действия пользователя. Нажатия кнопок, изменения значений полей, и другие пользовательские взаимодействия требуют обработки событий для обеспечения отзывчивости интерфейса.</w:t>
+      </w:r>
+    </w:p>
+    <w:p>
+      <w:pPr>
+        <w:widowControl/>
+        <w:autoSpaceDE/>
+        <w:autoSpaceDN/>
+        <w:spacing w:line="360" w:lineRule="auto"/>
+        <w:ind w:firstLine="709"/>
+        <w:jc w:val="both"/>
+        <w:rPr>
+          <w:sz w:val="28"/>
+          <w:szCs w:val="28"/>
+          <w:lang w:eastAsia="ru-RU"/>
+        </w:rPr>
+      </w:pPr>
+      <w:r>
+        <w:rPr>
+          <w:sz w:val="28"/>
+          <w:szCs w:val="28"/>
+          <w:lang w:eastAsia="ru-RU"/>
+        </w:rPr>
+        <w:t xml:space="preserve">Интеграция </w:t>
+      </w:r>
+      <w:proofErr w:type="spellStart"/>
+      <w:r>
+        <w:rPr>
+          <w:sz w:val="28"/>
+          <w:szCs w:val="28"/>
+          <w:lang w:eastAsia="ru-RU"/>
+        </w:rPr>
+        <w:t>WinForms</w:t>
+      </w:r>
+      <w:proofErr w:type="spellEnd"/>
+      <w:r>
+        <w:rPr>
+          <w:sz w:val="28"/>
+          <w:szCs w:val="28"/>
+          <w:lang w:eastAsia="ru-RU"/>
+        </w:rPr>
+        <w:t xml:space="preserve"> в среду разработки </w:t>
+      </w:r>
+      <w:proofErr w:type="spellStart"/>
+      <w:r>
+        <w:rPr>
+          <w:sz w:val="28"/>
+          <w:szCs w:val="28"/>
+          <w:lang w:eastAsia="ru-RU"/>
+        </w:rPr>
+        <w:t>Visual</w:t>
+      </w:r>
+      <w:proofErr w:type="spellEnd"/>
+      <w:r>
+        <w:rPr>
+          <w:sz w:val="28"/>
+          <w:szCs w:val="28"/>
+          <w:lang w:eastAsia="ru-RU"/>
+        </w:rPr>
+        <w:t xml:space="preserve"> </w:t>
+      </w:r>
+      <w:proofErr w:type="spellStart"/>
+      <w:r>
+        <w:rPr>
+          <w:sz w:val="28"/>
+          <w:szCs w:val="28"/>
+          <w:lang w:eastAsia="ru-RU"/>
+        </w:rPr>
+        <w:t>Studio</w:t>
+      </w:r>
+      <w:proofErr w:type="spellEnd"/>
+      <w:r>
+        <w:rPr>
+          <w:sz w:val="28"/>
+          <w:szCs w:val="28"/>
+          <w:lang w:eastAsia="ru-RU"/>
+        </w:rPr>
+        <w:t xml:space="preserve"> делает проектирование пользовательского интерфейса более интуитивным. Визуальный дизайнер позволяет разработчикам удобно размещать и </w:t>
       </w:r>
       <w:r>
         <w:rPr>
@@ -13093,84 +13340,7 @@
           <w:lang w:eastAsia="ru-RU"/>
         </w:rPr>
         <w:lastRenderedPageBreak/>
-        <w:t>полей, и другие пользовательские взаимодействия требуют обработки событий для обеспечения отзывчивости интерфейса.</w:t>
-      </w:r>
-    </w:p>
-    <w:p>
-      <w:pPr>
-        <w:widowControl/>
-        <w:autoSpaceDE/>
-        <w:autoSpaceDN/>
-        <w:spacing w:line="360" w:lineRule="auto"/>
-        <w:ind w:firstLine="709"/>
-        <w:jc w:val="both"/>
-        <w:rPr>
-          <w:sz w:val="28"/>
-          <w:szCs w:val="28"/>
-          <w:lang w:eastAsia="ru-RU"/>
-        </w:rPr>
-      </w:pPr>
-      <w:r>
-        <w:rPr>
-          <w:sz w:val="28"/>
-          <w:szCs w:val="28"/>
-          <w:lang w:eastAsia="ru-RU"/>
-        </w:rPr>
-        <w:t xml:space="preserve">Интеграция </w:t>
-      </w:r>
-      <w:proofErr w:type="spellStart"/>
-      <w:r>
-        <w:rPr>
-          <w:sz w:val="28"/>
-          <w:szCs w:val="28"/>
-          <w:lang w:eastAsia="ru-RU"/>
-        </w:rPr>
-        <w:t>WinForms</w:t>
-      </w:r>
-      <w:proofErr w:type="spellEnd"/>
-      <w:r>
-        <w:rPr>
-          <w:sz w:val="28"/>
-          <w:szCs w:val="28"/>
-          <w:lang w:eastAsia="ru-RU"/>
-        </w:rPr>
-        <w:t xml:space="preserve"> в среду разработки </w:t>
-      </w:r>
-      <w:proofErr w:type="spellStart"/>
-      <w:r>
-        <w:rPr>
-          <w:sz w:val="28"/>
-          <w:szCs w:val="28"/>
-          <w:lang w:eastAsia="ru-RU"/>
-        </w:rPr>
-        <w:t>Visual</w:t>
-      </w:r>
-      <w:proofErr w:type="spellEnd"/>
-      <w:r>
-        <w:rPr>
-          <w:sz w:val="28"/>
-          <w:szCs w:val="28"/>
-          <w:lang w:eastAsia="ru-RU"/>
-        </w:rPr>
-        <w:t xml:space="preserve"> </w:t>
-      </w:r>
-      <w:proofErr w:type="spellStart"/>
-      <w:r>
-        <w:rPr>
-          <w:sz w:val="28"/>
-          <w:szCs w:val="28"/>
-          <w:lang w:eastAsia="ru-RU"/>
-        </w:rPr>
-        <w:t>Studio</w:t>
-      </w:r>
-      <w:proofErr w:type="spellEnd"/>
-      <w:r>
-        <w:rPr>
-          <w:sz w:val="28"/>
-          <w:szCs w:val="28"/>
-          <w:lang w:eastAsia="ru-RU"/>
-        </w:rPr>
-        <w:t xml:space="preserve"> делает проектирование пользовательского интерфейса более интуитивным. Визуальный дизайнер позволяет разработчикам удобно размещать и настраивать элементы управления, визуально оценивать внешний вид приложения, что существенно ускоряет процесс разработки.</w:t>
+        <w:t>настраивать элементы управления, визуально оценивать внешний вид приложения, что существенно ускоряет процесс разработки.</w:t>
       </w:r>
     </w:p>
     <w:p>
@@ -13561,40 +13731,47 @@
           <w:szCs w:val="26"/>
           <w:lang w:eastAsia="ru-RU"/>
         </w:rPr>
+        <w:t>2.2. Функциональное назначение</w:t>
+      </w:r>
+      <w:bookmarkEnd w:id="9"/>
+    </w:p>
+    <w:p>
+      <w:pPr>
+        <w:widowControl/>
+        <w:autoSpaceDE/>
+        <w:autoSpaceDN/>
+        <w:spacing w:line="360" w:lineRule="auto"/>
+        <w:ind w:firstLine="709"/>
+        <w:jc w:val="both"/>
+        <w:rPr>
+          <w:sz w:val="28"/>
+          <w:szCs w:val="24"/>
+          <w:lang w:eastAsia="ru-RU"/>
+        </w:rPr>
+      </w:pPr>
+      <w:r>
+        <w:rPr>
+          <w:sz w:val="28"/>
+          <w:szCs w:val="24"/>
+          <w:lang w:eastAsia="ru-RU"/>
+        </w:rPr>
+        <w:t>Программа разработана для решения конкретного класса математических задач, а именно - вычисления ранга матрицы. В текущей версии программа предназначена для работы с матрицами размером три строки на три столбца. Важно отметить, что при создании программы предполагалось, что количество строк и столбцов матрицы являются целыми числами без знака.</w:t>
+      </w:r>
+      <w:r>
+        <w:rPr>
+          <w:sz w:val="28"/>
+          <w:szCs w:val="24"/>
+          <w:lang w:eastAsia="ru-RU"/>
+        </w:rPr>
+        <w:br/>
+      </w:r>
+      <w:r>
+        <w:rPr>
+          <w:sz w:val="28"/>
+          <w:szCs w:val="24"/>
+          <w:lang w:eastAsia="ru-RU"/>
+        </w:rPr>
         <w:lastRenderedPageBreak/>
-        <w:t>2.2. Функциональное назначение</w:t>
-      </w:r>
-      <w:bookmarkEnd w:id="9"/>
-    </w:p>
-    <w:p>
-      <w:pPr>
-        <w:widowControl/>
-        <w:autoSpaceDE/>
-        <w:autoSpaceDN/>
-        <w:spacing w:line="360" w:lineRule="auto"/>
-        <w:ind w:firstLine="709"/>
-        <w:jc w:val="both"/>
-        <w:rPr>
-          <w:sz w:val="28"/>
-          <w:szCs w:val="24"/>
-          <w:lang w:eastAsia="ru-RU"/>
-        </w:rPr>
-      </w:pPr>
-      <w:r>
-        <w:rPr>
-          <w:sz w:val="28"/>
-          <w:szCs w:val="24"/>
-          <w:lang w:eastAsia="ru-RU"/>
-        </w:rPr>
-        <w:t>Программа разработана для решения конкретного класса математических задач, а именно - вычисления ранга матрицы. В текущей версии программа предназначена для работы с матрицами размером три строки на три столбца. Важно отметить, что при создании программы предполагалось, что количество строк и столбцов матрицы являются целыми числами без знака.</w:t>
-      </w:r>
-      <w:r>
-        <w:rPr>
-          <w:sz w:val="28"/>
-          <w:szCs w:val="24"/>
-          <w:lang w:eastAsia="ru-RU"/>
-        </w:rPr>
-        <w:br/>
         <w:t xml:space="preserve">         </w:t>
       </w:r>
       <w:r>
@@ -39006,7 +39183,7 @@
         <v:path o:extrusionok="f" gradientshapeok="t" o:connecttype="rect"/>
         <o:lock v:ext="edit" aspectratio="t"/>
       </v:shapetype>
-      <v:shape id="_x0000_i1224" type="#_x0000_t75" style="width:95.4pt;height:63pt;flip:x;visibility:visible;mso-wrap-style:square" o:bullet="t">
+      <v:shape id="_x0000_i1104" type="#_x0000_t75" style="width:95.4pt;height:63pt;flip:x;visibility:visible;mso-wrap-style:square" o:bullet="t">
         <v:imagedata r:id="rId1" o:title=""/>
       </v:shape>
     </w:pict>

</xml_diff>